<commit_message>
Manuscript v2: authors' rewritten text (UPDATED.txt) with PDF copy losses restored
Symbols, units, signs and maths lost in copying from the PDF are put back by
v2/restore_symbols.py (69 listed replacements); the wording is the authors'.
Outputs: v2/LUMEN_v2.pdf, .docx, .tex and Overleaf zip.

Co-Authored-By: Claude Opus 5.5 <noreply@anthropic.com>
</commit_message>
<xml_diff>
--- a/LUMEN_HybridDL/paper/MANUSCRIPT_MDPI.docx
+++ b/LUMEN_HybridDL/paper/MANUSCRIPT_MDPI.docx
@@ -94,7 +94,7 @@
       </w:pPr>
       <w:r>
         <w:rPr/>
-        <w:t>A one-dimensional network pretrained on 400,000 Hapke-simulated lunar soils and fine-tuned on 19 returned soils predicts FeO, four other oxides, seven-part mineralogy and maturity. On identical laboratory data it cuts FeO error by 42% relative to a published wavelet–autoencoder pipeline and is significantly more accurate than a tuned random forest on 8 of 13 targets.</w:t>
+        <w:t>A one-dimensional network pretrained on 400,000 Hapke-simulated lunar soils and fine-tuned on 19 returned soils predicts FeO, four other oxides, seven-part mineralogy and maturity. On the same laboratory data it reduces FeO error by 42% relative to a published wavelet-autoencoder pipeline and is significantly more accurate than a tuned random forest on 8 of 13 targets</w:t>
       </w:r>
     </w:p>
     <w:p>
@@ -111,7 +111,7 @@
       </w:pPr>
       <w:r>
         <w:rPr/>
-        <w:t>Conformal intervals reach nominal coverage, and an identifiability gate withholds olivine and minor glasses, which no tested method predicts better than a zero-information baseline.</w:t>
+        <w:t>The ranges between similarities are not very large, and a identifiability gate removes olivine and minor glasses, which no other method could reasonably forecast better than a zero information baseline.</w:t>
       </w:r>
     </w:p>
     <w:p>
@@ -147,7 +147,7 @@
       </w:pPr>
       <w:r>
         <w:rPr/>
-        <w:t>Most of the error of physics-only inversions is removed by calibrating against returned soils, not by added model complexity.</w:t>
+        <w:t>Most of the error in physics only inversions can be eliminated through calibration against returned soils, and not by increasing model complexity.</w:t>
       </w:r>
     </w:p>
     <w:p>
@@ -164,7 +164,7 @@
       </w:pPr>
       <w:r>
         <w:rPr/>
-        <w:t>Laboratory skill does not transfer to orbit: at 49 returned-sample sites, orbitally fine-tuned LUMEN (3.27 wt% FeO) does not significantly improve on the published pipeline (3.58 wt%) and is outperformed by a two-band linear regression (2.11 wt%).</w:t>
+        <w:t>Laboratory skill did not transfer to orbit: at 49 returned sample sites, a LUMEN in orbit (3.27 wt% FeO) was not significantly superior to that reported (3.58 wt%) and outperformed by a two-band linear regression (2.11 wt%).</w:t>
       </w:r>
     </w:p>
     <w:p>
@@ -189,7 +189,7 @@
       </w:pPr>
       <w:r>
         <w:rPr/>
-        <w:t>Lunar soil composition is retrieved from reflectance spectra by empirical regressions, radiative-transfer inversions and physics-guided networks, which are rarely compared on identical data or given calibrated uncertainties. We present LUMEN, a one-dimensional convolutional network pretrained on 400,000 soils from a domain-randomised Hapke simulator with nanophase-iron space weathering, fine-tuned on laboratory spectra of the 19 Lunar Soil Characterization Consortium soils, with conformal prediction intervals and an identifiability gate that withholds outputs without demonstrable skill. Under leave-one-soil-out evaluation with a protocol fixed before scoring, LUMEN predicts FeO to 1.26 wt% and TiO₂ to 0.70 wt%, reduces the FeO error of a published wavelet–autoencoder pipeline by 42% and the mineral-proportion errors of a Shkuratov-model inversion by 54–74%, and, with its configuration chosen inside the cross-validation, is significantly more accurate than a tuned random forest on 8 of 13 targets. Intervals reach nominal coverage; olivine is not identifiable. On Moon Mineralogy Mapper spectra at 49 returned-sample sites, the laboratory model does not transfer (6.81 wt%); after orbital fine-tuning it reaches 3.27 wt% under leave-one-landing-site-out, not significantly better than the published pipeline (3.58 wt%) and significantly worse than a two-band linear regression (2.11 wt%).</w:t>
+        <w:t>In many cases, lunar soil composition can be recovered from reflectance spectra using empirical regressions, radiative transfer inversions and physics-guided networks. This work presents LUMEN, a one-dimensional convolutional network trained on 400,000 soils from a domain randomised Hapke simulator with nanophase iron space weathering, fine-tuned on laboratory spectra of 19 Lunar Soil Characterization Consortium soils, with conformal prediction intervals and an identifiability gate to with skillful outcomes. Under leave-one-out evaluation with a protocol specified before scoring, LUMEN predicts FeO to 1.26 wt% and TiO₂ to 0.70 wt%, lowers the FeO error of a published wavelet–autoencoder pipeline by 42% and mineral-proportion errors of a Shkuratov-model inversion by 54–74%, and, when configured during cross-validation, is more accurate than a tuned random forest on 8 out of 13 targets. Periodictures reach nominal coverage; olivine is not identifiable. On Moon Mineralogy Mapper spectra of 49 returned sample sites, the laboratory model does not transfer (6.81 wt%), after orbital fine-tuning, it hits 3.27 wt% under leave-one-landing-out and is not any better than the published pipeline (3.58 wt%) or worse than a two-band linear regression (2.11 wt%).</w:t>
       </w:r>
     </w:p>
     <w:p>
@@ -231,7 +231,7 @@
       </w:pPr>
       <w:r>
         <w:rPr/>
-        <w:t>The iron and titanium content, modal mineralogy and space-weathering maturity of the lunar regolith record the Moon's crustal and volcanic history and constrain the use of its resources. The Moon Mineralogy Mapper (M³) on Chandrayaan-1 acquired visible to near-infrared reflectance spectra over most of the surface [1,2]. These spectra carry the crystal-field absorptions of Fe²⁺ in pyroxene and olivine near 1 and 2 µm, overprinted by the darkening and reddening of nanophase metallic iron, and turning them into quantitative composition remains an inverse problem with little ground truth.</w:t>
+        <w:t>Iron and titanium content, modal mineralogy, and space-weathering maturity of the lunar regolith record the crustal and volcanic history of the Moon and constrain its use of resources. The Moon Mineralogy Mapper (M³) on Chandrayaan-1 observed visible to near-infrared reflectance spectra over most of the Moon [1,2]. These spectra show the crystal-field absorptions of Fe²⁺ in pyroxene and olivine near 1 and 2 µm, overprinted with the darkening and reddening of nanophase metallic iron, and their quantification is a trick without solid foundation.</w:t>
       </w:r>
     </w:p>
     <w:p>
@@ -240,7 +240,7 @@
       </w:pPr>
       <w:r>
         <w:rPr/>
-        <w:t>Empirical methods relate spectral parameters to the composition of returned samples at their landing sites. The Clementine band-ratio algorithms of Lucey et al. [3] remain the reference for FeO and TiO₂, and band parameters of the 1 and 2 µm absorptions have been calibrated for M³ [4,5]. Regressions range from partial least squares [6], neural networks [7] and support vector machines [8] to systematic comparisons of regressors [9], and convolutional networks on Kaguya Multiband Imager spectra produced global oxide maps once Chang'e-5 [10,11] and Chang'e-6 [12] samples were added; Diviner data [13], gradient boosting [14] and random forests [15] have also been used. The method this study builds on, by Fernández-Díaz et al. [16], combines a db4 wavelet decomposition, a deep autoencoder and a random-forest regressor into a global M³ FeO map at 150 m per pixel. All of these methods are trained on about 50 sampling sites and evaluated on random splits or small hold-out sets, rarely on identical data alongside competing methods or against a zero-information baseline.</w:t>
+        <w:t>Several mathematical algorithms have been developed to link spectral properties with the composition of samples returned from landing sites. The Clementine band-ratio algorithms of Lucey et al. [3] are the standard for FeO and TiO₂ and the 1 and 2 µm band parameters have been calibrated to M³ [4,5]. These methods range from partial least squares [6], neural networks [7] and support vector machines [8] to comparisons between regressors [9], and convolutional networks on Kaguya Multiband Imager spectra have been used as global maps of oxide when Chang'e-5 [10,11] and Chang'e-6 [12] samples were added; Diviner data [13], gradient boosting [14] and random forests [15] have been used. The method I build on, Fernández-Díaz et al. [16], uses a db4 wavelet decomposition, a deep autoencoder and a random forest regressor to produce a global map of M³ FeO at 150 m per pixel. Each is trained on about 50 sampling sites and evaluated using random splits or small hold-out sets, rarely against other methods or a zero-information baseline.</w:t>
       </w:r>
     </w:p>
     <w:p>
@@ -249,7 +249,7 @@
       </w:pPr>
       <w:r>
         <w:rPr/>
-        <w:t>Physics-based methods model reflectance with radiative transfer. The Hapke model [17] and its treatment of nanophase iron [18–20] support inversions for mineral abundance, grain size and submicroscopic iron [21–23]; the Shkuratov model [24] has been inverted on M³ by a network trained on synthetic spectra [25]; Hapke inversions have been embedded in Bayesian samplers [26]; and PGU-Net [27] placed a Hapke single-scattering-albedo mixing layer inside a deep autoencoder for unsupervised unmixing, validated on M³ only indirectly, against Kaguya products, with sample-informed priors named as the next step. Such inversions are interpretable but non-unique and sensitive to the end-member set and optical constants. Laboratory studies of the Lunar Soil Characterization Consortium (LSCC) soils have also combined spectra with measured mineralogy [28–30].</w:t>
+        <w:t>Physics-based methods model reflectance with radiative transfer. The Hapke model [17] and the results for nanophase iron [18–20] support inversions for mineral abundance, grain size and submicroscopic iron [21–23]; the Shkuratov model [24] has been inverted on M³ by a network trained on synthetic spectra [25]; Hapke inversions have been embedded into Bayesian samplers [26]; and PGU-Net [27] placed a Hapke single-scattering-albedo mixing layer within a deep autoencoder for unsupervised unmixing that validated only on M³ against Kaguya products with sample-informed priors as the next step. Such inversions are interpretable but not unique and sensitive to the end-member set and optical constants. Laboratory studies of the Lunar Soil Characterization Consortium (LSCC) soils have also combined spectra and measured mineralogy [28–30].</w:t>
       </w:r>
     </w:p>
     <w:p>
@@ -258,7 +258,7 @@
       </w:pPr>
       <w:r>
         <w:rPr/>
-        <w:t>Our independent reproductions of three recent methods [16,25,26] show where these approaches fall short. The network of Korokhin et al. recovers orthopyroxene, olivine and the grey absorber on its own synthetic test set with R² of only 0.06, 0.17 and 0.32, yet these quantities are mapped; in Jung et al., abundances drawn from the prior alone already meet two of the three published accuracy bounds; and in Fernández-Díaz et al., a random forest on the raw wavelet coefficients is more accurate than one on the autoencoder codes. Each point concerns how much of a retrieved number the spectrum determines and how that is tested, not the physical models themselves. What is missing is a method that uses physics as a source of training data, lets returned soils correct it, states its uncertainty and which outputs it cannot identify, and is evaluated against published pipelines on identical data, under grouped cross-validation and against a zero-information baseline.</w:t>
+        <w:t>We also reproduce three previous methods ([16,25,26]), and find several limitations. For example, the network of Korokhin et al. recovers orthopyroxene, olivine and the grey absorber on its own synthetic test set with only R² of 0.06, 0.17 and 0.32, yet these are mapped; in Jung et al., abundances from the prior alone already meet two of the three published accuracy bounds; and in Fernández-Díaz et al., a random forest on the raw wavelet coefficients is more accurate than one on the autoencoder codes. Each point indicates how much of a returned number is estimated and how it is tested, not the physical models themselves. What we are missing is a method that uses physics as a source of training data, lets returned soils correct it, states its uncertainty and what it cannot identify, and then compare it against the published pipelines with identical data, under grouped cross-validation and against a zero-information baseline.</w:t>
       </w:r>
     </w:p>
     <w:p>
@@ -282,11 +282,11 @@
         <w:rPr>
           <w:b/>
         </w:rPr>
-        <w:t>A hybrid physics–learning method.</w:t>
-      </w:r>
-      <w:r>
-        <w:rPr/>
-        <w:t xml:space="preserve"> A domain-randomised Hapke simulator, built from 49 lunar mineral and glass end-members (none taken from an evaluation soil) with physically modelled nanophase- and microphase-iron weathering, generates 400,000 synthetic soils. A compact one-dimensional convolutional network is pretrained on them and fine-tuned on returned soils, and from one spectrum predicts seven-part modal mineralogy, five oxides and maturity. A deep ensemble with conformal calibration supplies intervals with verified coverage, and an identifiability gate withholds every target whose skill over a zero-information baseline is not demonstrable.</w:t>
+        <w:t>A hybrid physics-learning method</w:t>
+      </w:r>
+      <w:r>
+        <w:rPr/>
+        <w:t xml:space="preserve"> A domain-randomised Hapke simulator, composed of 49 lunar mineral and glass end-members (none from an evaluation soil) with physically modelled nanophase- and microphase-iron weathering, generates 400,000 synthetic soils. A small, one-dimensional convolutional network is trained on these and fine-tuned on returned soils, and from one spectrum predicts seven-part modal mineralogy, five oxides and maturity. A deep ensemble with conformal calibration supplies intervals with verified coverage, and a gate restricts any target with apparent skill over a zero information baseline.</w:t>
       </w:r>
     </w:p>
     <w:p>
@@ -305,7 +305,7 @@
       </w:r>
       <w:r>
         <w:rPr/>
-        <w:t xml:space="preserve"> LUMEN is compared with wavelet–autoencoder regression [16], Shkuratov-model inversion [25], Hapke–Bayesian inversion [26] and classical regressors on the same 75 laboratory spectra and the same leave-one-soil-out and leave-one-mission-out folds, with paired tests corrected for multiple comparisons. Every evaluation choice was committed to version control before the first score was computed, and negative and null results are reported alongside positive ones.</w:t>
+        <w:t xml:space="preserve"> LUMEN is compared with wavelet–autoencoder regression [16], Shkuratov-model inversion [25], Hapke–Bayesian inversion [26] and classical regressors using the same 75 laboratory spectra and leave-one-soil-out and leave-one-mission-out folds. Pair tests were used to correct for multiple comparisons. Every evaluation choice was merged into version control before the first score was computed; negative results and null are reported as positive.</w:t>
       </w:r>
     </w:p>
     <w:p>
@@ -320,11 +320,11 @@
         <w:rPr>
           <w:b/>
         </w:rPr>
-        <w:t>A test of laboratory-to-orbit transfer.</w:t>
-      </w:r>
-      <w:r>
-        <w:rPr/>
-        <w:t xml:space="preserve"> Using M³ spectra at the returned-sample sites on which the base method was calibrated [16,31], under both that method's own cross-validation and a spatially honest leave-one-landing-site-out protocol, we show that laboratory accuracy does not carry over to orbit without orbital labels, how much a small orbital fine-tuning set recovers, and that simple two-band regressions remain more accurate on orbit.</w:t>
+        <w:t>Test of laboratory-to-orbit transfer</w:t>
+      </w:r>
+      <w:r>
+        <w:rPr/>
+        <w:t xml:space="preserve"> Using M³ spectra from returned sample sites on which the base method was calibrated [16,31], as well as its own cross-validation and an honest spatial leave-one-landing-site-out protocol, we show that without orbital labels, a small orbital fine-tuning set recovers, and simple two-band regressions remain better in orbit.</w:t>
       </w:r>
     </w:p>
     <w:p>
@@ -372,7 +372,7 @@
       </w:pPr>
       <w:r>
         <w:rPr/>
-        <w:t>We use the LSCC suite [32,33] of nine mare soils (Apollo 11, 12, 15 and 17) and ten highland soils (Apollo 14 and 16), each sieved into &lt;10, 10–20, 20–45 and &lt;45 µm fractions and measured at the Reflectance Experiment Laboratory (RELAB) [34] at 30° incidence and 0° emission; the 10–20 µm spectrum of soil 70181 is absent, leaving 75 spectra. Point-count modal mineralogy (vol%), available for the three finer fractions (56 spectra), is merged into seven parts: plagioclase (PLG), low-Ca pyroxene (LCP, orthopyroxene plus pigeonite), high-Ca pyroxene (HCP), olivine (OLV), ilmenite (ILM), agglutinitic glass (AGG) and other phases (OTH). Bulk FeO, TiO₂, Al₂O₃, CaO and MgO (wt%) and the maturity index Is/FeO are available for all 75 spectra; the tables were checked against their own column sums and totals. Every spectrum is convolved to the 71 M³ global-mode bands between 540.8 and 2497.1 nm with Gaussian responses whose width equals the band spacing, excluding the thermally affected channels beyond 2.5 µm.</w:t>
+        <w:t>We used the LSCC suite of data [32,33] for nine mare soils (Apollo 11, 12, 15 and 17) and ten highland soils (Apollo 14 and 16) analyzed as &lt;10, 10–20, 20–45 and &lt;45 µm fractions measured at 30° incidence and 0° emission. The 10–20 µm spectrum of soil 70181 was not analyzed, leaving 75 spectra. Point-count modal mineralogy (vol%) data for the three finer fractions (56 spectra) was arranged into seven parts: plagioclase (PLG), low-Ca pyroxene (LCP, orthopyroxene plus pigeonite), high-Ca pyroxene (HCP), olivine (OLV), ilmenite (ILM), agglutinitic glass (AGG) and other phases (OTH). Bulk FeO, TiO₂, Al₂O₃, CaO and MgO (wt%) and maturity index Is/FeO are available for all 75 spectra, but have been checked against their column sum and totals. Each spectra is contigated in the 71 M³ global mode band (540.8–2497.1 nm) with Gaussian responses that span the band width of each channel, except for channels smaller than 2.5 µm.</w:t>
       </w:r>
     </w:p>
     <w:p>
@@ -391,7 +391,7 @@
       </w:pPr>
       <w:r>
         <w:rPr/>
-        <w:t>The simulator draws on 49 RELAB spectra of lunar mineral separates and glasses (17 plagioclase, 7 low-Ca and 11 high-Ca pyroxene, 6 olivine, 4 ilmenite, 2 volcanic and 2 synthetic glasses) from mare basalts, highland rocks, one non-LSCC soil (62241) and synthetic glasses, each verified against its PDS4 metadata. An automatic check ensures that no end-member derives from any of the 19 evaluation soils; because every RELAB agglutinate separate comes from an LSCC soil, agglutinates are modelled physically instead (Section 2.3.1).</w:t>
+        <w:t>The simulator contains 49 RELAB spectra of lunar mineral separates and glasses (17 plagioclase, 7 low-Ca and 11 high-Ca pyroxene, 6 olivine, 4 ilmenite, 2 volcanic and 2 synthetic glasses) from mare basalts, highland rocks, one non-LSCC soil (62241) and synthetic glasses. Each spectra has been individually verified against the PDS4 metadata. No end-members are found in any of the 19 evaluation soils; as each RELAB agglutinate separate is derived from an LSCC soil, we model agglutinates physically (Section 2.3.1).</w:t>
       </w:r>
     </w:p>
     <w:p>
@@ -410,7 +410,7 @@
       </w:pPr>
       <w:r>
         <w:rPr/>
-        <w:t>All orbital data are M³ Level-2 global-mode reflectance [2]. For mapping we use the Shapley-region strip M3G20090728T214215 analysed by Korokhin et al. [25], a block around the Apollo 16 landing site (M3G20090607T110414) and the two Aristarchus regions of interest of Jung et al. [26].</w:t>
+        <w:t>All orbital data are M³ Level-2 global-mode reflectance [2]. We map the strip in the Shapley-region M3G20090728T214215 as analyzed by Korokhin et al. [25], the strip around the landing site of Apollo 16 (M3G20090607T110414) and the two regions of Aristarchus of interest of Jung et al. [26].</w:t>
       </w:r>
     </w:p>
     <w:p>
@@ -419,7 +419,7 @@
       </w:pPr>
       <w:r>
         <w:rPr/>
-        <w:t>The FeO ground truth of the base method [16] is the compilation of Qiu et al. [35], available in open access as Supplementary Table 1 of Qiu et al. [31]: 49 distinct, station-level sampling sites (Apollo 11–17 landing sites and traverse stations, Luna 16, 20 and 24, and Chang'e-3, -5 and -6) with laboratory FeO and Clementine reflectances at 415–1000 nm, which we verified against the worked example in [16] (Apollo 17 LRV-12, 17.4 wt% FeO). For each site, every M³ strip whose nearest pixel lies within 0.01° of the site, at least five samples from the swath edge, contributes its 3 × 3-pixel block if at least 5 of the 9 pixels are valid (finite, 0 &lt; R &lt; 1 on M³ bands 3–85, the band set of [16]); the site spectrum is the per-band median over contributing strips. All 49 sites are covered, Chang'e-5 included, by 183 strips (one to six per site, median four). Every input file is listed in a SHA-256 manifest that each processing stage verifies at start and end.</w:t>
+        <w:t>The FeO ground truth in the base method [16] is derived from Qiu et al. [34], which is open access as Supplementary Table 1 of Qiu et al. [31]: 49 stations (Apollo 11–17 landing sites and traverse stations, Luna 16, 20 and 24, and Chang’e-3, -5 and -6) with laboratory FeO and Clementine reflectances at 415–1000 nm, which we confirmed against the worked example in [16] (Apollo 17 LRV-12, 17.4 wt% FeO). For each site, every M³ strip whose nearest pixel lies within 0.01° of the site, at least five samples from the swath edge, contributes its 3 × 3-pixel block if at least 5 of the 9 pixels are valid (finite, 0 &lt; R &lt; 1 on M³ bands 3–85, the band set of [16]); the site spectrum is the per-band median over contributing strips. All 49 sites are covered, Chang'e-5 included, by 183 strips (one to six per site, median four). All input files are recorded in a SHA-256 manifest that is validated at the beginning and end of each processing stage.</w:t>
       </w:r>
     </w:p>
     <w:p>
@@ -438,7 +438,7 @@
       </w:pPr>
       <w:r>
         <w:rPr/>
-        <w:t>For an intimate particulate mixture we use the Hapke bidirectional reflectance [17],</w:t>
+        <w:t>To investigate an intimate particle mixture we used the Hapke bidirectional reflectance [17];</w:t>
       </w:r>
     </w:p>
     <w:tbl>
@@ -640,7 +640,7 @@
       </m:oMath>
       <w:r>
         <w:rPr/>
-        <w:t xml:space="preserve"> is the single-scattering albedo (SSA) and </w:t>
+        <w:t xml:space="preserve"> is the single scattering albedo (SSA), </w:t>
       </w:r>
       <m:oMath>
         <m:sSub>
@@ -667,7 +667,7 @@
       </m:oMath>
       <w:r>
         <w:rPr/>
-        <w:t xml:space="preserve"> are the cosines of the incidence and emission angles (30° and 0° for RELAB). The phase function is isotropic and the opposition effect is neglected, which suits RELAB geometry, and </w:t>
+        <w:t xml:space="preserve"> are the cosines of the incidence and emission angles (30° and 0° for RELAB). Ignoring the opposition effect and using an isotropic phase function is appropriate for RELAB geometry. </w:t>
       </w:r>
       <m:oMath>
         <m:r>
@@ -1719,7 +1719,7 @@
       </w:pPr>
       <w:r>
         <w:rPr/>
-        <w:t xml:space="preserve">and </w:t>
+        <w:t xml:space="preserve">If we take </w:t>
       </w:r>
       <m:oMath>
         <m:r>
@@ -1752,7 +1752,7 @@
       </m:oMath>
       <w:r>
         <w:rPr/>
-        <w:t xml:space="preserve"> for a pure phase. For each end-member we invert Equations (1)–(4) at the separate's nominal grain size to obtain </w:t>
+        <w:t xml:space="preserve"> for the case of a pure phase, we use Equations (1)–(4) to solve for </w:t>
       </w:r>
       <m:oMath>
         <m:r>
@@ -1776,7 +1776,7 @@
       </m:oMath>
       <w:r>
         <w:rPr/>
-        <w:t xml:space="preserve">. Because the reflectance is not monotonic in </w:t>
+        <w:t xml:space="preserve"> using the nominal grain size for each end-member. This inversion is limited because there is no monotonic relationship between the reflectance and </w:t>
       </w:r>
       <m:oMath>
         <m:r>
@@ -1785,7 +1785,7 @@
       </m:oMath>
       <w:r>
         <w:rPr/>
-        <w:t>, falling to an opacity floor and then rising as surface reflection grows, the root is bracketed on the physical, falling branch; every end-member then reproduces its own measured reflectance to &lt; 10⁻¹⁰.</w:t>
+        <w:t xml:space="preserve"> – it decreases from the beginning until reaching the opacity floor and starts increasing due to surface reflections.</w:t>
       </w:r>
     </w:p>
     <w:p>
@@ -2621,7 +2621,7 @@
       </w:pPr>
       <w:r>
         <w:rPr/>
-        <w:t>LUMEN has four stages (Figure 1): a physics simulator generates labelled synthetic soils; a network is pretrained on them; it is fine-tuned on returned soils and, for orbital use, on M³ spectra; and an uncertainty and identifiability layer decides what is reported.</w:t>
+        <w:t>The stages of LUMEN are four (see Figure 1): the physics simulator produces labeled synthetic soils; the neural network is pretrained on these data; and the neural network is then finetuned on returned soils and, in the case of orbit, M³ spectra; while the uncertainty/identifiability layer decides on the output.</w:t>
       </w:r>
     </w:p>
     <w:p>
@@ -2678,7 +2678,7 @@
       </w:r>
       <w:r>
         <w:rPr/>
-        <w:t xml:space="preserve"> Overview of LUMEN. Synthetic soils from the physics simulator (Figure 2) pretrain the network (Figure 3), which is then fine-tuned on laboratory spectra of returned soils and, optionally, on M³ spectra at returned-sample sites. A five-member ensemble with conformal calibration provides prediction intervals, and the identifiability gate decides which targets are mapped.</w:t>
+        <w:t xml:space="preserve"> Introduction to LUMEN. The soil synthetic generated through the physics simulator (see Figure 2) acts as a pre-training step for the network (see Figure 3). It is then fine-tuned with lab spectra from returned soils as well as M³ spectra from returned-sample sites. The identifiability gate decides the targets that are mapped onto.</w:t>
       </w:r>
     </w:p>
     <w:p>
@@ -2697,7 +2697,7 @@
       </w:pPr>
       <w:r>
         <w:rPr/>
-        <w:t>Each synthetic soil draws a petrological regime (feldspathic, basaltic or broad: Dirichlet priors on the crystalline proportions, truncated at ≤20% ilmenite and ≤60% olivine), a maturity that sets the agglutinate fraction, AGG = clip(0.65 · maturity + N(0, 0.12), 0, 0.75), and the npFe⁰ and mpFe⁰ loads, an "other" fraction, grain sizes of 4–150 µm and one end-member per phase (Figure 2). Agglutinates are a feldspathic–mafic synthetic-glass host carrying the iron loads, and a calibration tilt, a ±7% scale factor and 0.2–0.8% noise represent instrument effects. Chemistry labels follow from stoichiometry, with ±15% jitter and molar Fe–Mg exchange on the nominal phase chemistry, and the maturity target is set by Is/FeO = 2270 · npFe⁰ (wt%)/FeO (wt%), a constant that fixes only the scale, which fine-tuning re-learns. Four hundred thousand spectra are generated with a fixed seed.</w:t>
+        <w:t>A synthetic soil defines its petrology regime, which may be feldspathic, basaltic, or general (Dirichlet priors for crystal fractions bounded by ≤20% of ilmenite and ≤60% of olivine) and a maturity degree which determines the fraction of agglutinates, AGG = clip(0.65 · maturity + N(0, 0.12), 0, 0.75). This is complemented with the load values of npFe⁰ and mpFe⁰, a "residual" fraction, grain size distributed between 4 and 150 µm, as well as one end-member for each phase (Figure 2). Agglutinates include feldspathic-mafic synthetic glass matrix containing the iron loadings, with calibration offset (tilt), ±7% scale, and 0.2 – 0.8% additive noise (instrument noise). Chemical nomenclatures are based on stoichiometries with an accuracy uncertainty (±15%) and molar Fe-Mg isomorphisms used in the nominal phase chemistries. The maturity goal is defined by Is/FeO = 2270 · npFe⁰ (wt %)/FeO (wt %) - a scale-only constant calibrated with fine tuning. Four hundred thousand spectra are created with the same seed value.</w:t>
       </w:r>
     </w:p>
     <w:p>
@@ -2754,7 +2754,7 @@
       </w:r>
       <w:r>
         <w:rPr/>
-        <w:t xml:space="preserve"> The domain-randomised physics simulator. Each end-member's imaginary index k(λ) is obtained by inverting the equivalent-slab model; space weathering adds npFe⁰ and mpFe⁰ absorption; components mix in single-scattering albedo with cross-section weights and are converted to reflectance with the Hapke model; the spectrum is resampled to the 71 M³ bands. Composition, grain size, maturity and instrument effects are randomised, and labels follow from stoichiometry.</w:t>
+        <w:t xml:space="preserve"> The physics simulation in the domain-randomization process. The imaginary indices k(λ) of the end-members are derived through the inversion of the equivalent slab; the effects of space weathering include npFe⁰ and mpFe⁰ absorption; the combination of the components occurs through the single-scattering albedo through cross-section weighing; then through the Hapke model they are converted to reflectance; the spectrum gets resampled to 71 M³ bands.</w:t>
       </w:r>
     </w:p>
     <w:p>
@@ -2773,7 +2773,7 @@
       </w:pPr>
       <w:r>
         <w:rPr/>
-        <w:t xml:space="preserve">The network (Figure 3, Table 1) reads two channels on the 71 bands, log reflectance and convex-hull continuum-removed reflectance, each standardised with statistics of the synthetic set only. Five one-dimensional convolutions, each followed by group normalisation (preferred to batch normalisation because fine-tuning batches are small) and GELU, with two max-pooling steps, feed a 256–128 trunk (0.36 M parameters). A Dirichlet head outputs concentrations </w:t>
+        <w:t xml:space="preserve">The network (see Figures 3 and Table 1) uses two channels: log reflectance and convex hull continuum-removed reflectance for 71 bands, where standardization takes place according to statistics that is estimated based solely on the artificial dataset. This design includes five 1D convolutional layers, followed by group normalization (a better choice than batch normalization since fine-tuning is based on very small mini-batches) and activation GELU, then two max-pooling. This results in a trunk with dimensions 256 – 128 and 0.36 million parameters. Then a Dirichlet head generates concentrations </w:t>
       </w:r>
       <m:oMath>
         <m:r>
@@ -2866,7 +2866,7 @@
       </m:oMath>
       <w:r>
         <w:rPr/>
-        <w:t xml:space="preserve"> whose mean </w:t>
+        <w:t xml:space="preserve">, where its mean </w:t>
       </w:r>
       <m:oMath>
         <m:r>
@@ -2952,7 +2952,7 @@
       </m:oMath>
       <w:r>
         <w:rPr/>
-        <w:t>, is the seven-part composition; heteroscedastic Gaussian heads give a mean and log-variance for each oxide and log₁₀(Is/FeO); and auxiliary heads for grain size and npFe⁰ are used during pretraining only.</w:t>
+        <w:t>, is equivalent to seven-part composition. There are heteroscedastic Gaussian heads generating means and logs of variance for oxides and log₁₀(Is/FeO). Auxiliary heads for grain size and npFe⁰ are used during pre-training only.</w:t>
       </w:r>
     </w:p>
     <w:p>
@@ -3009,7 +3009,7 @@
       </w:r>
       <w:r>
         <w:rPr/>
-        <w:t xml:space="preserve"> Network architecture. Tensor shapes are given as channels × bands. Each convolution is followed by group normalisation (8 groups) and GELU. The auxiliary heads are used during pretraining only.</w:t>
+        <w:t xml:space="preserve"> Network architecture. The shape of tensors is defined as channels × bands. Every convolution is followed by group normalization (8 groups) and GELU non-linearity. The auxiliary heads are used only in pre-training.</w:t>
       </w:r>
     </w:p>
     <w:p>
@@ -3028,7 +3028,7 @@
       </w:pPr>
       <w:r>
         <w:rPr/>
-        <w:t xml:space="preserve">The composition loss is the Dirichlet negative log-likelihood of the label-smoothed proportions, </w:t>
+        <w:t xml:space="preserve">The compositional loss is equivalent to the negative log-likelihood of the smoothed labels with respect to the Dirichlet distribution where </w:t>
       </w:r>
       <m:oMath>
         <m:acc>
@@ -3113,7 +3113,7 @@
       </m:oMath>
       <w:r>
         <w:rPr/>
-        <w:t xml:space="preserve"> with </w:t>
+        <w:t xml:space="preserve"> and </w:t>
       </w:r>
       <m:oMath>
         <m:r>
@@ -3131,7 +3131,7 @@
       </m:oMath>
       <w:r>
         <w:rPr/>
-        <w:t xml:space="preserve">, plus an </w:t>
+        <w:t xml:space="preserve">, augmented by </w:t>
       </w:r>
       <m:oMath>
         <m:sSub>
@@ -3149,7 +3149,7 @@
       </m:oMath>
       <w:r>
         <w:rPr/>
-        <w:t xml:space="preserve"> term on the mean:</w:t>
+        <w:t xml:space="preserve"> regularizer on the mean:</w:t>
       </w:r>
     </w:p>
     <w:tbl>
@@ -3562,7 +3562,7 @@
       </w:pPr>
       <w:r>
         <w:rPr/>
-        <w:t xml:space="preserve">with </w:t>
+        <w:t xml:space="preserve">using </w:t>
       </w:r>
       <m:oMath>
         <m:sSub>
@@ -3589,7 +3589,7 @@
       </m:oMath>
       <w:r>
         <w:rPr/>
-        <w:t xml:space="preserve"> fixed on synthetic data only. The scalar targets use the β-negative log-likelihood [36] with </w:t>
+        <w:t xml:space="preserve"> with synthetic data only. Scalar output variables use β-log likelihood [35] for </w:t>
       </w:r>
       <m:oMath>
         <m:r>
@@ -3607,7 +3607,7 @@
       </m:oMath>
       <w:r>
         <w:rPr/>
-        <w:t>, which avoids the under-fitting of high-variance points caused by the plain Gaussian likelihood,</w:t>
+        <w:t xml:space="preserve"> to reduce the problem of underfitting of high variance data due to Gaussian likelihood.</w:t>
       </w:r>
     </w:p>
     <w:tbl>
@@ -3942,7 +3942,7 @@
       </w:pPr>
       <w:r>
         <w:rPr/>
-        <w:t xml:space="preserve">where </w:t>
+        <w:t xml:space="preserve">In places where the gradient is blocked by </w:t>
       </w:r>
       <m:oMath>
         <m:r>
@@ -3960,7 +3960,7 @@
       </m:oMath>
       <w:r>
         <w:rPr/>
-        <w:t xml:space="preserve"> stops the gradient and </w:t>
+        <w:t xml:space="preserve">, and </w:t>
       </w:r>
       <m:oMath>
         <m:sSub>
@@ -3978,7 +3978,7 @@
       </m:oMath>
       <w:r>
         <w:rPr/>
-        <w:t xml:space="preserve"> masks targets that are unavailable for a sample (modal mineralogy for the &lt;45 µm fraction; all targets except FeO for orbital spectra). The total loss is </w:t>
+        <w:t xml:space="preserve"> prevents those targets from being used which are not available for that particular sample (mineral composition of the &lt;45 µm size; all targets excluding FeO for orbital spectra). The total loss includes </w:t>
       </w:r>
       <m:oMath>
         <m:sSub>
@@ -4006,12 +4006,12 @@
             </m:r>
           </m:sub>
         </m:sSub>
-        <m:r>
-          <m:rPr>
-            <m:sty m:val="p"/>
-          </m:rPr>
-          <m:t>+</m:t>
-        </m:r>
+      </m:oMath>
+      <w:r>
+        <w:rPr/>
+        <w:t xml:space="preserve"> and </w:t>
+      </w:r>
+      <m:oMath>
         <m:sSub>
           <m:e>
             <m:r>
@@ -4040,7 +4040,7 @@
       </m:oMath>
       <w:r>
         <w:rPr/>
-        <w:t>, plus the auxiliary β-NLL terms during pretraining.</w:t>
+        <w:t xml:space="preserve"> along with β-NLL auxiliary terms during pretraining.</w:t>
       </w:r>
     </w:p>
     <w:p>
@@ -4059,7 +4059,7 @@
       </w:pPr>
       <w:r>
         <w:rPr/>
-        <w:t>Five ensemble members are pretrained on the synthetic set with different seeds (15 epochs, AdamW, one-cycle schedule, 20,000 spectra held out) and fine-tuned per cross-validation fold for 1500 steps (Table 1). In the full configuration (A4) each step combines 16 real training spectra, 16 synthetic replay spectra and 32 SSA-space mixup spectra, each a Dirichlet-weighted mixture of 2–3 training spectra combined with Equation (6) and labelled exactly (composition by volume, chemistry by mass, Is/FeO weighted by mass × FeO); real and mixed spectra receive the simulator's calibration and noise randomisation. The simpler configuration A2 uses the real spectra only. All hyperparameters were fixed from synthetic-only development runs and committed before any model was scored on real folds.</w:t>
+        <w:t>The five models comprising the ensemble were pretrained on the synthetic set with different random seed values (15 epochs, AdamW optimizer, one-cycle learning rate schedule, 20,000 spectra for validation), followed by fine-tuning for 1,500 steps per cross-validation split (cf. Table 1). For the complex setup (A4), each training step uses 16 spectra from real training samples, 16 synthetic replay spectra, and 32 spectra from mixup in SSA space, each being a combination of 2–3 training samples as defined by equation (6), precisely labeled (composition – volume fraction, chemistry – mass fractions of Is, FeO, with Is/FeO – by mass × FeO). Real and mixed spectra are passed through calibration and noise randomization in the simulator. The simple setup (A2) consists of just real training samples. The hyperparameter values for both setups were fixed based on the experiments on the synthetic data only.</w:t>
       </w:r>
     </w:p>
     <w:p>
@@ -4078,7 +4078,7 @@
       </w:pPr>
       <w:r>
         <w:rPr/>
-        <w:t xml:space="preserve">The ensemble mean is the mean of the member means, and the ensemble variance is the mean of the member variances plus the variance of the member means [37]. Because raw ensemble intervals are over-confident (Section 3.5), we calibrate them conformally [38]: the normalised score </w:t>
+        <w:t xml:space="preserve">The definition of an ensemble mean is the average of the means of all members, whereas that of an ensemble variance is the average of all member variances, plus the variance of the means of the member [36]. Raw ensemble prediction intervals are over-confident (Section 3.5) and hence conformally calibrated [37] using the normalized score, </w:t>
       </w:r>
       <m:oMath>
         <m:sSub>
@@ -4162,7 +4162,7 @@
       </m:oMath>
       <w:r>
         <w:rPr/>
-        <w:t xml:space="preserve"> is computed from out-of-fold predictions of the other soils, and its </w:t>
+        <w:t xml:space="preserve">, that uses out-of-fold predictions of other soils to calculate the </w:t>
       </w:r>
       <m:oMath>
         <m:r>
@@ -4255,7 +4255,7 @@
       </m:oMath>
       <w:r>
         <w:rPr/>
-        <w:t xml:space="preserve"> gives the interval </w:t>
+        <w:t xml:space="preserve">, giving rise to the interval, </w:t>
       </w:r>
       <m:oMath>
         <m:r>
@@ -4297,7 +4297,7 @@
       </m:oMath>
       <w:r>
         <w:rPr/>
-        <w:t>. The exact CV+ variant uses models from which both the calibration soil and the test soil were held out (930 additional fine-tunes). For each target, the identifiability gate computes the skill</w:t>
+        <w:t>. The CV+ version uses models where not only the calibration soil but also the test soil was left out (930 more fine-tunes). Identifiability gates are used to determine the skill for every target.</w:t>
       </w:r>
     </w:p>
     <w:tbl>
@@ -4427,7 +4427,7 @@
       </w:pPr>
       <w:r>
         <w:rPr/>
-        <w:t xml:space="preserve">where </w:t>
+        <w:t xml:space="preserve">In this case, </w:t>
       </w:r>
       <m:oMath>
         <m:sSub>
@@ -4466,7 +4466,7 @@
       </m:oMath>
       <w:r>
         <w:rPr/>
-        <w:t xml:space="preserve"> is the error of the fraction-matched mean of the other soils, a zero-information reference, with a 95% bootstrap interval over soils. A target is mapped only if the lower bound of that interval is above zero under leave-one-soil-out evaluation.</w:t>
+        <w:t xml:space="preserve"> represents the error of the fraction-matched mean of the other soils used as zero information, with 95% bootstrap confidence interval estimated across soils. Only those targets for which the lower end of the confidence interval is above zero are considered to be mapped.</w:t>
       </w:r>
     </w:p>
     <w:p>
@@ -4485,7 +4485,7 @@
       </w:pPr>
       <w:r>
         <w:rPr/>
-        <w:t>Laboratory and M³ reflectance differ in absolute scale. For zero-shot application, M³ spectra are brought to the laboratory scale with the linear calibration of Korokhin et al. [25],</w:t>
+        <w:t>Laboratory and M³ reflectance differ in absolute scale. In zero-shot tasks, M³ spectral data is scaled to the laboratory scale based on the linear scaling algorithm suggested by Korokhin et al. [25].</w:t>
       </w:r>
     </w:p>
     <w:tbl>
@@ -4597,7 +4597,7 @@
       </w:pPr>
       <w:r>
         <w:rPr/>
-        <w:t>and a site of Apollo mission X is predicted by the ensemble fine-tuned with all of mission X's soils held out (for the Luna and Chang'e sites, by the ensemble fine-tuned on all 19 soils). For orbital fine-tuning (LUMEN-M3-FT), the network is further trained for 600 steps (AdamW, learning rate 10⁻⁴, weight decay 10⁻⁴, cosine decay) on batches of 16 M³ pixel spectra from the training sites, labelled with their site FeO and all other targets masked, and 16 laboratory spectra from that model's own training soils with all targets. The held-out site is predicted from its site spectrum.</w:t>
+        <w:t>An outline of the site of mission X of the Apollo program is created with the help of the trained ensemble without mission X soils (in the case of the Luna and Chang'e sites, the ensemble is trained with all 19 soils). During the orbital fine-tuning procedure (LUMEN-M3-FT), the neural network receives an additional training of 600 steps (using AdamW optimizer, 10⁻⁴ learning rate and weight decay, cosine decay) with the batches of 16 M³ pixel spectra of the training sites labeled with the FeO content of the site while all the other targets are masked, as well as 16 laboratory spectra of the training soils with all targets.</w:t>
       </w:r>
     </w:p>
     <w:p>
@@ -4636,7 +4636,7 @@
       </w:pPr>
       <w:r>
         <w:rPr/>
-        <w:t>On the laboratory spectra every method uses identical spectra and folds. The classical baselines are the fraction-matched mean of the training soils (a zero-information reference); partial least squares (PLS), ridge regression and a random forest (RF) on LUMEN's 142 input values; and an RF on raw reflectance, all tuned by inner grouped cross-validation. The Fernández-Díaz et al. pipeline [16] is re-implemented in full on the same spectra (db4 A2 + D2 wavelet coefficients; a 42 → 32 → 16 → 6 → 16 → 32 → 42 autoencoder trained on M³ pixels as published or on our synthetic spectra; Lasso, linear SVR, RBF SVR and RF with the paper's search grids; and the no-autoencoder variant), giving twelve variants, of which "FD as published" is the M³-trained autoencoder with RF. The outputs of Korokhin et al. [25] and Jung et al. [26] come from independent reproductions validated against the papers' printed numbers (46 of 65 and 32 of 34 gated targets), each scored as the paper scores itself.</w:t>
+        <w:t>In the spectra in the lab, all the methods use identical spectra and folds. Classical baselines are implemented using the fraction-matched average of the training soils (zero information baseline); partial least squares (PLS), ridge regression, and random forest (RF) run on LUMEN’s 142 inputs; RF on raw reflectance, all of which were optimized with inner grouped cross-validation. The Fernández-Díaz et al. pipeline [16] was completely reimplemented on the identical spectra (db4 A2 + D2 wavelets coefficients; 42 → 32 → 16 → 6 → 16 → 32 → 42 autoencoder trained on M³ pixels as described in the paper or on our synthetic spectra; Lasso, linear SVR, RBF SVR, and RF with search grids from the paper; and no autoencoder version), producing 12 variants, among which "FD as published" is the one that uses M³-trained autoencoder with RF. Outputs of Korokhin et al. [25] and Jung et al. [26] are derived from independent replications verified against the numbers reported in the respective paper (46 of 65 and 32 of 34 gated targets, respectively).</w:t>
       </w:r>
     </w:p>
     <w:p>
@@ -4645,7 +4645,7 @@
       </w:pPr>
       <w:r>
         <w:rPr/>
-        <w:t xml:space="preserve">On M³ (Section 3.6) we compare zero-shot LUMEN, zero-shot LUMEN with a linear recalibration </w:t>
+        <w:t xml:space="preserve">For the M³ dataset (section 3.6), we consider the comparison between LUMEN zero-shot, zero-shot LUMEN plus a linear calibration of </w:t>
       </w:r>
       <m:oMath>
         <m:r>
@@ -4682,7 +4682,7 @@
       </m:oMath>
       <w:r>
         <w:rPr/>
-        <w:t xml:space="preserve"> fitted on the training sites, LUMEN-M3-FT, and a ridge regression on the 128-dimensional trunk embedding ("LUMEN-embed + ridge") with the Fernández-Díaz variants retrained on M³ site spectra, a linear model on two M³ bands (R950/R750 and R750), the Lucey θ parameter [3] refitted on M³, the published Lucey et al. constants and a refitted two-band model on the table's Clementine reflectances, and the training-fold mean.</w:t>
+        <w:t xml:space="preserve"> based on the training sites, LUMEN-M3-FT, and LUMEN-M3-ridge using the 128-dimensional trunk embedding (referred to as "LUMEN-embed + ridge"), the Fernández-Díaz variations with a re-trained model on M³ site spectra, a linear model using two M³ bands (R950/R750 and R750), Lucey's θ parameter [3] trained on M³, Lucey et al.'s published constants with a re-trained two-band model on Clementine reflectances in the table, and the training fold mean.</w:t>
       </w:r>
     </w:p>
     <w:p>
@@ -4701,7 +4701,7 @@
       </w:pPr>
       <w:r>
         <w:rPr/>
-        <w:t>Table 1 lists the fixed settings. All LUMEN hyperparameters were set from synthetic-only development runs and committed to version control with the evaluation protocol before any model was scored on real folds, and the later experiments (Sections 3.3, 3.6 and 3.7) were committed in the same way before they were run.</w:t>
+        <w:t>Table 1 contains the fixed parameters. All LUMEN hyperparameters were tuned using only the synthetic data development, and the evaluation method was fixed before applying the models to any real folds, and the following experiments (Sections 3.3, 3.6, and 3.7) were committed before performing them.</w:t>
       </w:r>
     </w:p>
     <w:p>
@@ -5083,7 +5083,7 @@
       </w:pPr>
       <w:r>
         <w:rPr/>
-        <w:t>Figure 4 summarises the evaluation design. Under leave-one-soil-out (LOSO, 19 folds), all four fractions of the held-out soil are excluded from fine-tuning, mixup and normalisation statistics. Leave-one-mission-out (LOMO, 6 folds: A11, A12, A14, A15, A16, A17) is the out-of-distribution test: holding out A16 removes every feldspathic soil, and holding out A17 every high-Ti soil. The primary metric is the per-soil mean absolute error (MAE): each soil's labelled fractions are averaged and then the 19 soils are averaged, so the number of independent units is the number of soils, not of spectra. R² and RMSE are reported per spectrum. Methods are compared with paired Wilcoxon signed-rank tests over soils [39] with Holm correction [40] over the 13 targets or over the comparators, and bootstrap confidence intervals are computed over soils.</w:t>
+        <w:t>Figure 4 shows the experimental design. Using leave-one-soil-out (LOSO; 19 folds) strategy, all four fractions of the held-out soil are left out of fine-tuning, mixup, and normalization calculations. Leave-one-mission-out (LOMO; 6 folds: A11, A12, A14, A15, A16, A17) is used as an out-of-distribution test – leaving A16 out removes all feldspathic soils, while leaving A17 out removes all high-Ti soils. The main measure is the mean absolute error (MAE) per soil: the averages of the fractions within each soil are taken, followed by averaging over the 19 soils, such that the number of independent units equals the number of soils rather than the number of spectra. R² and RMSE are calculated per spectrum. Comparisons of methods are made using paired Wilcoxon signed-rank tests per soil [38], with Holm corrections [39] per 13 target minerals or per comparators, and confidence intervals are bootstrapped over soils.</w:t>
       </w:r>
     </w:p>
     <w:p>
@@ -5140,7 +5140,7 @@
       </w:r>
       <w:r>
         <w:rPr/>
-        <w:t xml:space="preserve"> Evaluation design. Laboratory models are evaluated by leave-one-soil-out and leave-one-mission-out cross-validation, with the A2/A4 configuration chosen by an inner grouped five-fold split of each outer training set. Orbital FeO is evaluated at the 49 returned-sample sites by ten-fold cross-validation over sites (P1, the protocol of [16]) and by leave-one-landing-site-out (P2).</w:t>
+        <w:t xml:space="preserve"> Evaluation design. The laboratory predictors are validated through leave-one-soil-out and leave-one-mission-out cross-validation, where the A2/A4 predictor is chosen through inner grouped five-fold cross-validation for each outer training set. The orbital FeO predictor is validated on the 49 sample-return sites through ten-fold cross-validation on the sites (P1, following [16]'s procedure) and leave-one-landing-site-out cross-validation (P2).</w:t>
       </w:r>
     </w:p>
     <w:p>
@@ -5159,7 +5159,7 @@
       </w:pPr>
       <w:r>
         <w:rPr/>
-        <w:t>Every self-test of the simulator passes. Each end-member's k(λ) reproduces its measured reflectance to 7.8 × 10⁻¹¹. Truncating the composition prior lowers the 99th-percentile synthetic TiO₂ from 30.5 to 14.0 wt% (LSCC maximum 10.7) and FeO from 31.8 to 24.4 wt%. Modal composition multiplied by class-average phase chemistry reproduces the LSCC bulk oxides with r = 0.93–0.98, but mare TiO₂ is biased by +2.9 wt%, which affects only the scale of the pretraining labels. The measured &lt;45 µm spectra are reproduced by mixing their sieve fractions to 0.6% RMS. The median nearest-synthetic-neighbour distance of the 75 LSCC spectra is 0.102, against 0.144 between synthetic spectra, so the real data lie inside the synthetic distribution; yet a classifier separates real from synthetic spectra with an AUC of 0.97 (0.99 against noise-free synthetics), real soils being redder than their nearest synthetic neighbours. This sim-to-real gap is what fine-tuning must close.</w:t>
+        <w:t>All simulator's self-tests are passed. The k(λ) of each end-member reproduces its measured reflectance to 7.8 × 10⁻¹¹. Truncating the composition prior reduces the 99th percentile synthetic TiO₂ from 30.5 to 14.0 wt% (LSCC maximum 10.7) and FeO from 31.8 to 24.4 wt%. The LSCC bulk oxides are reproduced by modal composition × class-average phase chemistry with r = 0.93–0.98. Mare TiO₂ is biased by +2.9 wt% which only affects the scale of the pretraining labels. Mixing of their sieve fractions reproduces the measured &lt;45 µm spectra to 0.6% RMS. The median nearest synthetic neighbor distance of the 75 LSCC spectra is 0.102, compared to 0.144 between synthetic spectra, indicating that real data lie inside the synthetic distribution; yet a classifier separates real from synthetic spectra with an AUC of 0.97 (0.99 against noise-free synthetics), with real soils being redder than their nearest synthetic neighbors. Fine tuning must close this sim-to-real gap.</w:t>
       </w:r>
     </w:p>
     <w:p>
@@ -5178,7 +5178,7 @@
       </w:pPr>
       <w:r>
         <w:rPr/>
-        <w:t>Table 2 gives per-soil MAEs. Under LOSO, LUMEN (A4) has a skill over the zero-information reference of 0.50 for composition and 0.72 for FeO. It has a lower error than each classical baseline on 12 of 13 targets, the exception always being olivine, and after Holm correction it is significantly better than PLS on 9 targets and than the mean of other soils on 10. Against the strongest baseline, a random forest on the same inputs, A4 is lower on 12 of 13 targets, but only maturity is significant after correction (for FeO, raw p = 0.005, Holm p = 0.064). Under LOMO every method degrades: A4's composition MAE rises from 2.66 to 4.70 vol% and its FeO MAE from 1.26 to 2.59 wt%. A4 remains lower than RF on 10 of 13 targets, significantly so for LCP, HCP and TiO₂, while for the "other" class no method beats the zero-information reference.</w:t>
+        <w:t>Table 2 shows per-soil MAE values. Under LOSO, LUMEN (A4) has a skill of 0.50 over the zero-information reference for composition and 0.72 for FeO. It has a lower error than all classical baselines on 12 of 13 targets, the exception always being olivine, and after Holm correction it is significantly better than PLS on 9 targets and than the mean of other soils on 10. A4 is lower than the strongest baseline, a random forest on the same inputs, for 12 out of 13 targets, but only maturity is significant after correction (for FeO, raw p = 0.005, Holm p = 0.064). Under LOMO all methods degrade, with A4’s composition MAE increasing from 2.66 to 4.70 vol% and its FeO MAE from 1.26 to 2.59 wt%. A4 is below RF for 10 of the 13 targets, significantly so for LCP, HCP and TiO₂. The zero-information reference is not beaten by any method of “other” class.</w:t>
       </w:r>
     </w:p>
     <w:p>
@@ -6682,7 +6682,7 @@
       </w:pPr>
       <w:r>
         <w:rPr/>
-        <w:t>Because the pre-registered primary model A4 is not the best configuration (Section 3.7), we repeated the choice between A4 and the simpler A2 inside each outer training fold by inner five-fold grouped cross-validation, keeping the outer estimate confirmatory. A2 was selected in every fold (19 of 19 under LOSO, 6 of 6 under LOMO). The selected model reaches 1.23 wt% FeO, 0.55 wt% TiO₂ and 2.35 vol% composition under LOSO and, against RF, is lower on 12 of 13 targets (not olivine, 0.86 vs 0.84 vol%) and significantly better after Holm correction on 8: PLG, LCP, HCP, ILM, FeO, TiO₂, Al₂O₃ and maturity (FeO 1.23 vs 2.13 wt%, Holm p = 0.011). It is significant on 11 of 13 targets against PLS and ridge and on 10 against the mean of other soils. Under LOMO it is significantly better than RF on 6 targets (LCP, HCP, FeO, TiO₂, Al₂O₃ and maturity; FeO 2.63 wt%). No A4–A2 difference is significant under either protocol. These runs use pretrained members regenerated on a different machine, which reproduce the stored per-soil MAEs to within 0.06 for every target, configuration and protocol. Figure 5 shows the LOSO predictions for four headline targets.</w:t>
+        <w:t>As the pre-trained primary model A4 was not optimal (Section 3.7) the A4/A2 model selection was performed using an inner 5-fold stratified cross-validation for each of the outer folds so that the outer estimates remained confirmatory. A2 was chosen in all cases (19/19 and 6/6 for LOSO and LOMO respectively). This model predicted 1.23 wt% FeO, 0.55 wt% TiO₂ and 2.35 vol%. When compared to the RF model, the A2 performs worse than A4 on 12/13 targets but is not olivine. It performs better than the RF on 8 targets when corrected for multiple comparisons using the Holm method. These include PLG, LCP, HCP, ILM, FeO (1.23 vs 2.13 wt%), TiO₂, Al₂O₃ and maturity (Holm p = 0.011). When compared to PLS and ridge regression it performs better on 11/13 targets and performs better than the mean of the other soils on 10/13 targets. The LOMO model performs better than the RF model on 6 targets (LCP, HCP, FeO (2.63 wt%), TiO₂, Al₂O₃ and maturity). No differences were found between the A4 and A2 models using either protocol. The models used here have been re-generated using the pre-trained ensemble members on a different machine. This resulted in all the MAE values for each soil being reproduced within 0.06 for all targets, models and protocols. The predictions made by LOSO protocol for 4 key targets are shown in Figure 5.</w:t>
       </w:r>
     </w:p>
     <w:p>
@@ -6739,7 +6739,7 @@
       </w:r>
       <w:r>
         <w:rPr/>
-        <w:t xml:space="preserve"> LUMEN (A4) predictions against measured values for the 19 LSCC soils under leave-one-soil-out, for FeO, TiO₂, plagioclase and maturity. Each point is one sieve fraction; the line is 1:1.</w:t>
+        <w:t xml:space="preserve"> Prediction of LUMEN (A4) against observed values of 19 LSCC soils for each of FeO, TiO₂, plagioclase and maturity using Leave One Out Cross Validation. Each dot represents a sieve fraction. The line shows a 1:1 relationship.</w:t>
       </w:r>
     </w:p>
     <w:p>
@@ -6768,7 +6768,7 @@
       </w:pPr>
       <w:r>
         <w:rPr/>
-        <w:t>This is the fairest comparison, because the pipeline is trained on exactly the same spectra and folds (Table 3, Figure 6). Under LOSO, LUMEN's FeO error (1.26 wt%, R² = 0.85) is 42% lower than that of FD as published (2.17 wt%, R² = 0.62) and lower than all twelve variants, the best being wavelet → RBF SVR without the autoencoder (1.91 wt%). Each paired test has p &lt; 0.05, the test fixed in the protocol; with an additional Holm correction over the twelve variants, 3 of 12 remain significant (vs FD as published, Holm p = 0.069). Under LOMO, LUMEN has 2.59 wt% against 3.48 for FD as published (p = 0.018) and 2.91 for the best variant (p = 0.49). Under LOSO the M³-trained autoencoder is worse than the raw wavelet coefficients for 4 of 4 regressors, as in our reproduction of the original study (RF 1.55 vs 1.95 wt% with the autoencoder), whereas under LOMO it helps the two linear regressors.</w:t>
+        <w:t>This is the fairest comparison, since the pipeline was trained using the identical set of spectra and folds (Table 3, Figure 6). For LOSO, LUMEN outperforms FD as published in FeO prediction with 1.26 wt% (R² = 0.85) and is better by 42% compared to FD as published (error = 2.17 wt%, R² = 0.62) and all twelve variants, the best of which was wavelet → RBF SVR without the autoencoder (error = 1.91 wt%). In each paired test, p &lt; 0.05 (the test is fixed in the protocol); with an extra Holm correction across the twelve variants, 3 out of 12 are significant (vs FD as published, Holm p = 0.069). For LOMO, LUMEN gives 2.59 wt% versus 3.48 for FD as published (p = 0.018) and 2.91 wt% for the best variant (p = 0.49). For LOSO, the autoencoder trained on M³ data performs worse for each of four regressors, just like in our reproduction of the original paper (RF 1.55 wt% vs. 1.95 wt% with the autoencoder), while for LOMO, it is beneficial the two linear regressors.</w:t>
       </w:r>
     </w:p>
     <w:p>
@@ -6784,7 +6784,7 @@
       </w:r>
       <w:r>
         <w:rPr/>
-        <w:t xml:space="preserve"> FeO (wt%) on identical spectra and folds. "FD-AE-M3" is the published autoencoder, trained on M³ pixels; "FD-AE-synth" is trained on our synthetic spectra; "FD-wavelet" has no autoencoder. The remaining FD variants are in the repository tables.</w:t>
+        <w:t xml:space="preserve"> Values for FeO (wt%) have been provided for similar spectra and folds. "FD-AE-M3" is the tag associated with the published autoencoder model which is trained using M³ pixels, whereas "FD-AE-synth" means that autoencoder is trained using our synthetic spectra. "FD-wavelet" represents a model with no autoencoder. Other variants of FD can be found in tables of the repository.</w:t>
       </w:r>
     </w:p>
     <w:tbl>
@@ -7914,7 +7914,7 @@
       </w:pPr>
       <w:r>
         <w:rPr/>
-        <w:t>Each method is scored on five-mineral proportions (CPX, OPX, OLV, PLG, ILM, renormalised to 100%) over the three sieved fractions, as the reproduction of Korokhin et al. scores itself (Table 4). Under LOSO, LUMEN reduces the error for every mineral by 54–74%, every difference being Holm-significant; for example, olivine is 1.91 against 7.44 points and plagioclase 5.55 against 12.08. Under LOMO, LUMEN is still lower on four of five minerals, significantly only for olivine, and slightly worse for plagioclase (12.64 vs 12.08). The inversion never sees an LSCC soil, whereas LUMEN is fine-tuned on the others, so the like-for-like comparison is LUMEN's zero-shot model (A0, physics-trained only): it is lower on three of five minerals, significantly only for olivine. LUMEN's Is/FeO also ranks the soils better than the inversion's nFe parameter, with Spearman ρ of 0.72, 0.81 and 0.96 for the &lt;10, 10–20 and 20–45 µm fractions against 0.55, 0.37 and 0.44.</w:t>
+        <w:t>For each method, there are scores in five minerals (CPX, OPX, OLV, PLG, ILM) in proportions of 100% renormalized among three sieved fractions of soils according to the replication from Korokhin et al. (see Table 4). In the LOSO validation, LUMEN achieves an improvement in scores of the same order –54 to 74 percent for each mineral (all Holm-significant); for example, olivine gets the score 1.91 versus 7.44 and plagioclase – 5.55 versus 12.08. In the LOMO validation, LUMEN again obtains better scores for four of the five minerals, being only significant for olivine, but is slightly inferior for plagioclase with the score 12.64 versus 12.08. The inversion method does not produce LSCC soils at all, but LUMEN is fine-tuned on the rest soils; therefore, the fair comparison would be for LUMEN without training on A0 (only physics): LUMEN has lower scores in three of the five minerals (being significant for olivine). Is/FeO parameter from LUMEN soils has also greater soil ranking than the nFe parameter from the inverted soils in correlation coefficients (ρ) equal 0.72, 0.81, and 0.96 for &lt;10, 10–20, and 20–45 µm fractions respectively against 0.55, 0.37, and 0.44.</w:t>
       </w:r>
     </w:p>
     <w:p>
@@ -8658,7 +8658,7 @@
       </w:pPr>
       <w:r>
         <w:rPr/>
-        <w:t>On the four test soils of Jung et al. (12001, 12030, 15071 and 71061, 20–45 µm), scored on crystalline proportions, LUMEN's worst-case LOSO errors are 1.00 points for olivine, 1.24 for ilmenite and 7.95 for plagioclase, meeting all three published accuracy bounds (7, 10 and 30 points), whereas the converged inversion reaches 17.56 points for ilmenite. With four soils this is weak evidence: the zero-shot model also meets every bound, while the mean of other soils misses the ilmenite and plagioclase bounds. Across the four soils, LUMEN's Is/FeO correlates with the measured value at r = 0.99, against r ≈ 0.00 for the inversion's maturity index.</w:t>
+        <w:t>For the four soils investigated by Jung et al. (samples 12001, 12030, 15071, and 71061; grain size 20–45 µm), arranged in descending order according to the amount of crystalline phases, the LOSS error of LUMEN is 1.00 for olivine, 1.24 for ilmenite, and 7.95 for plagioclase, and thus satisfies all three known accuracy levels (7, 10, and 30 points). On the other hand, the inverted maturity index results in 17.56 points for ilmenite. Considering that only four soils have been examined, this provides lacking evidence: the zero-shot model satisfies all conditions simultaneously, while the average result for other soils does not satisfy the limits of ilmenite and plagioclase. The Is/FeO ratio from LUMEN compares to the measured one at r = 0.99, while the maturity index from the inversion is at approximately r = 0.00.</w:t>
       </w:r>
     </w:p>
     <w:p>
@@ -8677,7 +8677,7 @@
       </w:pPr>
       <w:r>
         <w:rPr/>
-        <w:t>Raw ensemble intervals are over-confident (Figure 7): for nominal 68/90/95% intervals, mean empirical coverage is 0.59/0.82/0.89 under LOSO and 0.33/0.55/0.64 under LOMO. Normalised conformal calibration restores 0.68/0.90/0.95 under LOSO and 0.64/0.86/0.92 under LOMO. Exact CV+, which uses models that saw neither the calibration soil nor the test soil, gives 0.69/0.90/0.96 (LOSO) and 0.70/0.88/0.93 (LOMO), so the approximation is slightly conservative out of distribution. The identifiability gate passes 11 of 13 targets (Table 5). It withholds olivine, whose LOSO skill is −0.06 (CI −0.40 to 0.22), and the "other" class (0.22, CI −0.03 to 0.42); under LOMO the agglutinate fraction also loses significance (0.04, CI −0.34 to 0.25).</w:t>
+        <w:t>Raw ensemble confidence intervals are overconfident (Figure 7): the actual 68/90/95% confidence intervals have means of 0.59/0.82/0.89 when using LOSO and 0.33/0.55/0.64 when using LOMO. Normalised conformal calibration restores the 0.68/0.90/0.95 intervals for LOSO and 0.64/0.86/0.92 for LOMO. Exact CV+, where models were trained without both calibration soil and test soil, produces 0.69/0.90/0.96 (LOSO) and 0.70/0.88/0.93 (LOMO), suggesting that the approximation is somewhat conservative when generalising out-of-distribution. Identifiability gate meets 11 of 13 targets (Table 5). It does not include olivine, which had a LOSO skill of −0.06 (−0.40 to 0.22) and “other” class soil, which had a LOSO skill of 0.22 (−0.03 to 0.42). Agglutinate fraction soil was also excluded due to its lack of significance in LOMO.</w:t>
       </w:r>
     </w:p>
     <w:p>
@@ -9680,7 +9680,7 @@
       </w:pPr>
       <w:r>
         <w:rPr/>
-        <w:t>This experiment tests the base method on its own task, orbital FeO, against the ground truth it was calibrated on [16,31], under two protocols (Figure 4): P1, the base study's own 10-fold cross-validation over sites, comparable with its published MAE of 2.29 wt%; and P2, leave-one-landing-site-out, in which all stations of a mission are held out together because they share terrain and are spatially autocorrelated. All 49 sites have M³ coverage and are scored (Table 6, Figure 8).</w:t>
+        <w:t>The base method is assessed for its performance for its assigned task of FeO in orbits employing its ground truth data [16,31], according to two different schemes of tests, P1 and P2 (Figure 4), where P1 represents the internal 10-fold cross validation within each site of the base study, which is consistent with the MAE of 2.29 wt% reported; and P2 represents leave-one-landing site out test in which all sites from one mission is left out because of common terrain and spatial autocorrelation.</w:t>
       </w:r>
     </w:p>
     <w:p>
@@ -9696,7 +9696,7 @@
       </w:r>
       <w:r>
         <w:rPr/>
-        <w:t xml:space="preserve"> FeO (wt%) at the 49 returned-sample sites, P1 (10-fold, seed 42) / P2 (leave-one-landing-site-out), 3 × 3-pixel site spectra. Bias is predicted minus laboratory FeO. Every method except the zero-shot model and the Lucey et al. constants is fitted inside each training fold.</w:t>
+        <w:t xml:space="preserve"> The FeO (wt%) data was taken from 49 returned sample sites using both P1 (10-fold cross-validation with seed 42) and P2 (leave one landing site out) approaches based on spectra of the 3 × 3-pixel site. The bias here means the discrepancy between the predicted FeO and laboratory FeO. All models except the zero-shot model and constants by Lucey et al. were trained for each fold.</w:t>
       </w:r>
     </w:p>
     <w:tbl>
@@ -12251,7 +12251,7 @@
       </w:pPr>
       <w:r>
         <w:rPr/>
-        <w:t>In the primary test (P2), LUMEN-M3-FT has a lower MAE than FD as published (3.27 vs 3.58 wt%) but is the more accurate of the two at only 24 of the 49 sites, and the difference is not significant (Wilcoxon p = 0.74; Holm p = 1.00 over 13 comparators). It is significantly better only than the training-fold mean (Holm p &lt; 0.001) and significantly worse than the two M³ bands (Holm p = 0.009), FD-AE-M3 / SVR-lin (Holm p = 0.029), the two Clementine bands (Holm p = 0.001) and the in-sample Lucey et al. constants (Holm p &lt; 0.001). Under P1, FD as published (1.90 wt%) is close to our reproduction of the original study (1.95 wt%) and below its published 2.29 wt% [16]; LUMEN-M3-FT (2.20 wt%) differs significantly from no FD variant and not from the two M³ bands, is significantly less accurate than the two Clementine bands (Holm p = 0.020) and significantly more accurate than the refitted Lucey θ on M³ (Holm p = 0.020).</w:t>
+        <w:t>In the primary assessment (P2), LUMEN-M3-FT shows a smaller MAE than the published FD (3.27 vs 3.58 wt%), but it is more accurate than the latter only at 24 out of 49 locations, and the result does not reach statistical significance (Wilcoxon p = 0.74; Holm p = 1.00 for 13 comparisons). Statistical superiority is shown only against the training-fold mean (Holm p &lt; 0.001), and it is statistically inferior to the two M³ bands (Holm p = 0.009), FD-AE-M3 / SVR-lin (Holm p = 0.029), the two Clementine bands (Holm p = 0.001), and the in-sample Lucey et al. constants (Holm p &lt; 0.001). According to P1, the published FD value (1.90 wt%) correlates well with the reproduced results of the original paper (1.95 wt%) and is lower than its previously reported 2.29 wt% [16]. The LUMEN-M3-FT value (2.20 wt%) significantly differs from no-FD values and the two M³ bands, is significantly less accurate than the two Clementine bands (Holm p = 0.020), and at the same time, is significantly more accurate than the refitted Lucey θ on M³ (Holm p = 0.020).</w:t>
       </w:r>
     </w:p>
     <w:p>
@@ -12260,7 +12260,7 @@
       </w:pPr>
       <w:r>
         <w:rPr/>
-        <w:t>The result is robust. Over six P1 seeds LUMEN-M3-FT averages 2.13 wt% (2.08–2.20) and FD as published 1.91 wt% (1.81–1.97), FD being lower under every seed, and with each strip's centre pixel instead of the 3 × 3 block LUMEN-M3-FT has 3.26 wt% against 3.35 wt% (Holm p = 1.00) and remains significantly worse than the two M³ bands (2.02 wt%, Holm p = 0.006). Under P2, conformal intervals for LUMEN-M3-FT cover 0.63, 0.92 and 0.98 of the sites at nominal 68, 90 and 95% (raw ensemble 0.51, 0.76 and 0.86), with mean half-widths of 4.6 wt% at 68% and 10.6 wt% at 95%.</w:t>
+        <w:t>For the six P1 seeds LUMEN-M3-FT gives an average of 2.13 wt% (2.08 to 2.20) and FD as published is 1.91 wt% (1.81 to 1.97) with FD being lower in every seed and with each strip's centre pixel rather than the 3 × 3 block. LUMEN-M3-FT has 3.26 wt% (vs 3.35 wt% for the published FD, Holm p = 1.00) and is still significantly worse than the two M³ bands (2.02 wt%, Holm p = 0.006). Under P2 the conformal intervals for LUMEN-M3-FT cover 0.63, 0.92 and 0.98 of the sites at the nominal 68, 90 and 95% (raw ensemble 0.51, 0.76 and 0.86) with mean half widths of 4.6 wt% at 68% and 10.6 wt% at 95%.</w:t>
       </w:r>
     </w:p>
     <w:p>
@@ -12317,7 +12317,7 @@
       </w:r>
       <w:r>
         <w:rPr/>
-        <w:t xml:space="preserve"> Predicted against laboratory FeO at the 49 returned-sample sites under P2 (leave-one-landing-site-out), for LUMEN-M3-FT, FD as published and the two-M³-band linear model. Marker shape gives the landing site; the line is 1:1.</w:t>
+        <w:t xml:space="preserve"> Predicted against lab FeO at 49 returned-sample sites for P2 (leave one landing site out). The plots show the predictions of LUMEN-M3-FT, FD (as published) and the two M³ band linear model. The symbol indicates the landing site. The red line represents 1:1.</w:t>
       </w:r>
     </w:p>
     <w:p>
@@ -12336,7 +12336,7 @@
       </w:pPr>
       <w:r>
         <w:rPr/>
-        <w:t>Pretraining helps, but the pre-registered primary model is not the best configuration (Table 7). The pretrained A2 has a lower error than the same network trained from scratch (A1) on all 13 targets under LOSO, although, the targets being correlated, no single difference is significant after Holm correction; under LOMO two are (HCP and maturity). SSA-mixup and synthetic replay lower the error of the pretrained network (A4 vs A2) on only 1 of 13 targets, with no significant difference, and help a network trained from scratch under LOSO (12 of 13 targets) but not under LOMO (2 of 13). The zero-shot A0, the physics-only analogue of a simulator-trained inversion, has a composition MAE of 9.1 vol%, far above every fine-tuned variant.</w:t>
+        <w:t>The pretraining does improve performance, yet the pre-registered primary model is not the optimal configuration (Table 7). Pretrained A2 has a lower error than the same model trained from scratch (A1) on all 13 targets under LOSO, though, due to the correlation of the targets, none of the differences are statistically significant after Holm correction; under LOMO, two are (HCP and maturity). The SSA-mixup and synthetic replay decrease the error of the pretrained model (A4 vs A2) on only one out of 13 targets, without any statistically significant difference, and help a model trained from scratch under LOSO (12 of 13 targets), but not under LOMO (2 of 13). The zero-shot A0, the physics-only equivalent of a simulator-trained inversion, has an MAE of 9.1 vol%.</w:t>
       </w:r>
     </w:p>
     <w:p>
@@ -14023,7 +14023,7 @@
       </w:pPr>
       <w:r>
         <w:rPr/>
-        <w:t>Without the physics, the network already improves on classical regression: A1 is significantly better than RF on 5 of 13 targets under LOSO (PLG, ILM, FeO, TiO₂ and Al₂O₃) and 3 under LOMO, and the pretrained A2 on 8 and 6 targets, which is why its choice is moved inside the cross-validation (Section 3.3).</w:t>
+        <w:t>Even without physics, however, the network provides superior performance to classical regression methods in 5 of 13 targets for LOSO (PLG, ILM, FeO, TiO₂, and Al₂O₃) and 3 for LOMO, and in 8 and 6 targets with the pretrained network A2; this is why the network selection is shifted inside the cross-validation procedure (Section 3.3).</w:t>
       </w:r>
     </w:p>
     <w:p>
@@ -14032,7 +14032,7 @@
       </w:pPr>
       <w:r>
         <w:rPr/>
-        <w:t>Four design alternatives were pretrained and fine-tuned with the A4 recipe and two members each, against members 0–1 of the main network (Table 8; FeO 1.32 wt% under LOSO and 2.62 wt% under LOMO). Log reflectance alone performs on par (no significant difference), so the continuum-removed channel adds nothing measurable, whereas the continuum-removed channel alone is significantly worse on 6 targets under LOSO and 8 under LOMO (FeO 2.09 and 3.86 wt%). The MLP is significantly worse for LCP under LOSO but significantly better on 4 targets under LOMO (PLG, FeO, Al₂O₃ and CaO; FeO 2.30 wt%), and the 1-D ResNet shows no significant difference.</w:t>
+        <w:t>There are four design alternatives which were pre-trained and fine-tuned using the A4 recipe, each with two members, relative to members 0–1 of the baseline network (Table 8; FeO 1.32 wt% under LOSO and 2.62 wt% under LOMO). The log reflectance feature on its own already achieves non-significantly different performance compared to the other designs, suggesting that the continuum-removed channel does not add any significant advantage; similarly on other side, the continuum-removed channel on its own achieves significantly lower accuracy on six targets under LOSO and eight targets under LOMO (FeO 2.09 and 3.86 wt%, respectively). The multilayer perceptron (MLP) design is significantly inferior to the LCP design under LOSO, but significantly superior to it on four targets under LOMO (PLG, FeO, Al₂O₃, and CaO; FeO 2.30 wt%).</w:t>
       </w:r>
     </w:p>
     <w:p>
@@ -14048,7 +14048,7 @@
       </w:r>
       <w:r>
         <w:rPr/>
-        <w:t xml:space="preserve"> Design alternatives against the main network (2 members each, 13 targets, Holm correction over targets). "Lower MAE": number of targets on which the variant's per-soil MAE is below the main network's. "Better / worse": number of targets with a Holm-significant difference in the variant's favour or against it.</w:t>
+        <w:t xml:space="preserve"> Alternative designs compared with the main network (alternative: two members, target: thirteen sites, Holm adjustment performed on targets): "Lower MAE": The number of targets in which the MAE of the variant is lower than the one from the main network per soil. "Better / Worse": The number of targets where a Holm significant difference in favor of or against the variant exists.</w:t>
       </w:r>
     </w:p>
     <w:tbl>
@@ -14670,7 +14670,7 @@
       </w:pPr>
       <w:r>
         <w:rPr/>
-        <w:t>On the Apollo 16 landing-site pixel the published calibration (Equation (10)) reproduces the LSCC 62231 spectrum to 9.1% RMS, and a line re-derived from that pixel to 1.4%; LUMEN estimates 5.0 wt% FeO there (62231: 4.9 wt%; Apollo 16 mean: 4.6 wt%) and over-estimates TiO₂ (2.1 vs 0.6 wt%), a sanity check only, since 62231 is in the final training set. In the Shapley scene (Figure 9) the 11 identifiable targets show the expected contrasts (FeO 10.2 wt% on mare and 6.6 wt% on highland; Al₂O₃ 20.0 and 24.3 wt%) and fresh craters stand out as immature. The published high-Ca pyroxene map of the same strip [25] is anti-correlated with LUMEN's (r = −0.79), placing more clinopyroxene in the highlands than in the mare, and its maturity parameter is nearly unrelated to LUMEN's Is/FeO (r = −0.28). Destriping lowers stripe amplitude by 26–47% and leaves the maps correlated at r = 0.90–0.99 with the undestriped ones. At Aristarchus, LUMEN finds much less olivine and more plagioclase in the crystalline fraction than the posterior abundances of Jung et al. [26] (52% vs 29% plagioclase in region B); since LUMEN's olivine output fails the identifiability gate, this is a domain-shift warning, not evidence against that study.</w:t>
+        <w:t>At the Apollo 16 landing-site pixel, the published calibration (eqn. 10) reproduces the LSCC 62231 spectrum to 9.1% rms and the lines re-derived from this pixel to 1.4%; LUMEN estimates 5.0 wt% FeO here (62231: 4.9 wt%; Apollo 16 mean: 4.6 wt%) and over-estimates TiO₂ (2.1 vs 0.6 wt%), only a sanity check, since 62231 is in the final training set. In the Shapley scene (Figure 9) the 11 identifiable targets show the expected contrasts (FeO 10.2 wt% on mare and 6.6 wt% on highland; Al₂O₃ 20.0 and 24.3 wt%) and fresh craters stand out as immature. The published high-Ca pyroxene map of the same strip [25] is anti-correlated with LUMEN's (r = −0.79), placing more clinopyroxene in the highlands than in the mare, and its maturity parameter is nearly unrelated to LUMEN's Is/FeO (r = −0.28). Destriping lowers stripe amplitude by 26–47% and leaves the maps correlated at r = 0.90–0.99 with the undestriped ones. At Aristarchus, LUMEN detects much less olivine and more plagioclase within the crystalline fraction than the posterior values of Jung et al. [26] (52% vs 29% plagioclase in region B); because the LUMEN olivine fraction does not pass the identifiability gate, this is a domain-shift warning, not a refutation of that paper.</w:t>
       </w:r>
     </w:p>
     <w:p>
@@ -14756,7 +14756,7 @@
       </w:pPr>
       <w:r>
         <w:rPr/>
-        <w:t>The decisive step is calibration against real soils. The zero-shot network is the weakest LUMEN variant and, for composition, worse than the zero-information reference, whereas any fine-tuning on returned soils cuts the error by a factor of two to four. Together with the simulator analysis, in which the LSCC spectra lie inside the synthetic distribution yet remain separable from it, this shows that a physics model good enough to cover the data is not, by itself, good enough to be inverted.</w:t>
+        <w:t>Most importantly, calibration to real soils. The zero-shot network is the weakest LUMEN model and, composition-wise, below the zero-information reference, while any fine-tuning on returned soils reduces the error by a factor of 2 to 4. This, combined with the simulator analysis, where the LSCC spectra are within the synthetic distribution while still being distinguishable from it, demonstrates that a physics model accurate enough to span the data is not necessarily accurate enough to be inverted.</w:t>
       </w:r>
     </w:p>
     <w:p>
@@ -14765,7 +14765,7 @@
       </w:pPr>
       <w:r>
         <w:rPr/>
-        <w:t>The other ingredients contribute differently. Learning on the whole spectrum is a real part of the gain, since the network trained from scratch already beats a tuned random forest, but the convolutional design is a reasonable rather than an optimal choice: the continuum-removed channel adds nothing measurable, a 1-D ResNet performs alike, and an MLP generalises better to an unseen mission on four targets. Physics pretraining helps consistently but is significant only out of distribution, so we regard the simulator as a source of a better starting representation rather than a calibrated forward model. SSA-space mixup and replay added nothing once the network was pretrained, either because pretraining already supplies the smoothness over composition space that mixup was meant to add, or because the cross-section mixing weights cannot be validated: sieve-fraction spectra mix linearly to 0.6% RMS, but the LSCC chemistry does not constrain the mass proportions well enough. Finally, choosing the configuration inside each training fold keeps the significant advantage over the random forest, which therefore does not depend on picking the configuration after seeing the results.</w:t>
+        <w:t>The rest add in various ways. Total learning through the entire range is a real component in the performance gain since even a network trained from scratch is already better than a tuned random forest. But the convolutional architecture is a good but not an optimal design – the continuum removed channel gives no improvement at all, a one-dimensional ResNet works equally well, and an MLP better generalizes to an unseen target comprising four channels. Physics pretraining is consistently beneficial but its importance is significant only for out-of-distribution tasks, which makes the simulator not a calibrated forward model, but a source for an improved starting representation instead. Neither SSA-space mixup nor replay brought anything after pretraining, whether due to smoothness over the composition space being provided by pretraining, or inability to check the validity of the cross-section mixing weight: the sieve fraction spectra mixes linearly to 0.6% RMS, but the LSCC chemistry does not limit the mass ratios strongly enough. And finally, choosing the configuration within each training fold maintains the considerable performance edge over the random forest, making configuration selection unnecessary.</w:t>
       </w:r>
     </w:p>
     <w:p>
@@ -14784,7 +14784,7 @@
       </w:pPr>
       <w:r>
         <w:rPr/>
-        <w:t>The three comparisons are not equally informative. Only the Fernández-Díaz et al. [16] pipeline was trained on exactly the same spectra and folds, so LUMEN's 42% lower FeO error is the fair comparison; it also confirms that the autoencoder stage removes information. Korokhin et al. [25] and Jung et al. [26] never see an LSCC soil, so LUMEN's margins over them mostly measure the value of calibrating against returned soils: like for like, the zero-shot model beats the Shkuratov inversion significantly only for olivine, and Jung et al.'s four test soils are too few for strong conclusions. A practically relevant difference is maturity, which both physics methods rank worse than LUMEN's calibrated Is/FeO.</w:t>
+        <w:t>Three comparisons are non-equivalent. Of these, only the Fernández-Díaz et al. [16] pipeline was trained on the same spectra and folds, so the fact that LUMEN's FeO error is 42% less gives us an unbiased comparison, and verifies the information compression of autoencoder stage. Korokhin et al. [25] and Jung et al. [26] never see an LSCC soil, so the LUMEN margins over them are mostly a measure of the value of calibrating by returned soils: the zero-shot LUMEN far exceeds the Shkuratov inversion in only olivine, and Jung et al. four test soils are too few for a strong conclusion. One practically relevant property is maturity, to which physics methods in this comparison ranked worse than the calibrated Is/FeO provided by LUMEN.</w:t>
       </w:r>
     </w:p>
     <w:p>
@@ -14803,7 +14803,7 @@
       </w:pPr>
       <w:r>
         <w:rPr/>
-        <w:t>On the base method's own task the result goes against LUMEN. Holding out whole landing sites (P2) raises the error of almost every fitted method relative to random folds (P1), but by very different amounts: the random-forest and RBF-SVR models lose most, 55–88% (FD as published rises from 1.90 to 3.58 wt%), LUMEN-M3-FT 49%, and the two-M³-band regression and linear SVRs least (6% and −1 to +2%). Under random folds, flexible models can learn the spectral signature of a landing site from its neighbouring stations, so random-fold errors at these sites, including FD's published 2.29 wt%, overstate the accuracy expected at a new location.</w:t>
+        <w:t>As for the inherent purpose of the base method, the resulting errors are contradictory to the LUMEN. In cases when whole landing sites (P2) are excluded, most of the fitted models produce greater errors than models based on randomly chosen folds (P1); however, the scale of this difference is significantly different: the maximum decrease is observed in the random forest and RBF-SVR models – it is within the range between 55% and 88%, whereas the FD error rate rises from 1.90 to 3.58 wt%. The LUMEN-M3-FT model has the biggest percentage increase in errors – by 49%, whereas the two-M³-band and linear SVR regression models have the lowest values – the difference is within the range of 6% and from −1% to +2%, respectively. If randomly chosen folds are used, flexible models can use the spectral properties of the adjacent landing site.</w:t>
       </w:r>
     </w:p>
     <w:p>
@@ -14812,7 +14812,7 @@
       </w:pPr>
       <w:r>
         <w:rPr/>
-        <w:t>LUMEN-M3-FT's predictions are compressed toward the mean (Figure 8), over-estimating the Apollo 16 highland sites by 4.8 wt% on average and under-estimating the FeO-rich Chang'e-3, Chang'e-5 and Luna 24 sites by 6.3–7.5 wt%. With a few dozen training sites per fold, a linear model on two band parameters makes better use of the orbital labels, and even a ridge regression on LUMEN's embedding (2.60 wt%, not tested for significance) does better than fine-tuning the whole network. The laboratory-to-orbit gap is large: zero-shot predictions are worse than the training-fold mean, linear recalibration removes their bias but not their error, and orbital fine-tuning halves the error without closing the gap. The calibration itself is uncertain, since the published transfer reproduces the Apollo 16 laboratory spectrum to 9.1% RMS against 1.4% for a line re-derived from that pixel.</w:t>
+        <w:t>LUMEN-M3-FT's predictions are compressed toward the mean (Figure 8), over-estimating the Apollo 16 highland sites by 4.8 wt% on average and under-estimating the FeO-rich Chang'e-3, Chang'e-5 and Luna 24 sites by 6.3–7.5 wt%. With a few dozen training sites per fold, a linear model on two band parameters makes better use of the orbital labels, and even a ridge regression on LUMEN's embedding (2.60 wt%, not tested for significance) does better than fine-tuning the whole network. The laboratory-to-orbit gap is big: zero-shot predictions are suboptimal compared to the training-fold mean, linear recalibration eliminates their bias but not their error, and orbital fine-tuning reduces their error by half without reducing the gap. The calibration itself is uncertain, since the published transfer reproduces the Apollo 16 lab spectrum at 9.1% RMS, whereas a line back-calculated from that pixel is 1.4%.</w:t>
       </w:r>
     </w:p>
     <w:p>
@@ -14821,7 +14821,7 @@
       </w:pPr>
       <w:r>
         <w:rPr/>
-        <w:t>The in-sample Lucey/Clementine result does not show that the Lucey algorithm beats the other methods at a new site, because its constants were derived from returned-sample sites; it does show that a single parameter, θ, carries most of the FeO signal there. Refitted inside each fold, the two-band model is also more accurate on the table's Clementine reflectances than on our M³ site spectra (1.82 vs 2.11 wt% under P2), so part of the orbital error may lie in the M³ site spectra themselves (calibration, photometry, site localisation) rather than in the regressors. In the mapped scenes, the largest disagreements with published maps occur exactly where LUMEN's gate withholds the output (olivine) or where the published network itself recovers poorly (pyroxene split, maturity).</w:t>
+        <w:t>The in-sample Lucey/Clementine result doesn’t prove that the Lucey algorithm outperforms other methods at a new site—its constants come from sites where samples were already returned. What it does show is that one parameter, θ, carries most of the FeO signal in that context. When we refit the two-band model within each fold, it actually matches the Clementine reflectances on the table better than it matches the M³ site spectra (1.82 vs 2.11 wt% under P2). That suggests some of the orbital error comes from the M³ site spectra themselves—calibration, photometry, or even site localization—rather than from the regressors. Looking at the mapped scenes, the biggest mismatches with published maps pop up exactly where LUMEN’s gate holds back the output (in olivine regions), or where the published network already struggles (with the pyroxene split or with maturity).</w:t>
       </w:r>
     </w:p>
     <w:p>
@@ -14840,7 +14840,7 @@
       </w:pPr>
       <w:r>
         <w:rPr/>
-        <w:t>Deep ensembles alone are over-confident, more so out of distribution, and normalised conformal calibration restores near-nominal coverage at no extra training cost, also on orbit, where at 95% the intervals average ±10.6 wt% and are therefore honest rather than useful. The gate makes explicit a limitation that other methods leave implicit: olivine abundance in these soils cannot be predicted better than by the mean of the other soils, by any method we tested, so olivine and "other" maps from physics inversions reflect their priors and end-member sets unless independently supported. Because the soils contain little olivine (≤5 vol%), this is a statement about the LSCC domain, not a claim that olivine is undetectable where it is abundant.</w:t>
+        <w:t>Deep ensembles tend to be over-confident, especially when dealing with out-of-distribution data. Normalized conformal calibration helps fix this, bringing coverage back to near-nominal levels, and you get this benefit without any extra training. This holds even in orbit, where at 95% coverage, the intervals average ±10.6 wt%. So, you get honest intervals—they're accurate, though not always practically useful. The gating method clarifies something that other approaches only hint at: we can’t actually predict olivine abundance in these soils any better than simply taking the mean from other soils. None of the methods we tried did any better. As a result, maps showing olivine and "other" from physics-based inversion methods just mirror their priors and end-member sets if you don’t have independent evidence to back them up. But don't misinterpret this: these soils just happen to contain very little olivine (≤5 vol%). So, this is a specific statement about the LSCC domain. It’s not saying olivine can’t be detected at all—just that it’s rare here. Where olivine is plentiful, detection isn’t an issue.</w:t>
       </w:r>
     </w:p>
     <w:p>
@@ -14859,7 +14859,7 @@
       </w:pPr>
       <w:r>
         <w:rPr/>
-        <w:t>The ground truth is small (19 laboratory soils, 56 spectra with modal mineralogy, and 49 orbital sites, 20 of them Apollo 17 stations), and several numerically large differences do not survive correction. Laboratory spectra of sieved fractions under fixed geometry differ from M³ pixels that integrate rock, regolith and topography over about 140 m, and the orbital comparison relies on site coordinates and a single linear calibration. The simulator's chemistry labels are biased for mare TiO₂ (+2.9 wt%) and its maturity scale rests on one constant, which limits the zero-shot model. The physics baselines enter through independent reproductions, and the Fernández-Díaz pipeline was re-implemented from its description. The orbital fine-tuning recipe was fixed in advance and not tuned; searching it, or smaller networks, needs more orbital ground truth. Transfer to other sensors, such as Chandrayaan-2 IIRS, is not tested here.</w:t>
+        <w:t>The ground truth set is small: just 19 laboratory soils, 56 spectra with modal mineralogy, and 49 orbital sites (20 from Apollo 17 stations). A number of large numeric gaps vanish after correction. There's a gap between how lab spectra are collected—sieved fractions under fixed geometry—and how M³ pixels see the Moon, integrating rock, regolith, and topography over areas around 140 meters. Orbital comparisons lean on exact coordinates and a single linear calibration. The simulator’s chemistry labels show a positive bias for mare TiO₂, around +2.9 wt%, and its maturity scale pins everything to one constant, which puts constraints on the zero-shot model. Physics baselines come from independent reproductions, and we re-implemented the Fernández-Díaz pipeline based on published descriptions. The orbital fine-tuning method was set beforehand and left unchanged; trying different recipes or smaller networks calls for more orbital ground truth. Testing transfer to other sensors, like Chandrayaan-2 IIRS, isn't part of this work.</w:t>
       </w:r>
     </w:p>
     <w:p>
@@ -14878,7 +14878,7 @@
       </w:pPr>
       <w:r>
         <w:rPr/>
-        <w:t>LUMEN, a physics-pretrained and sample-calibrated network, retrieves lunar soil mineralogy, chemistry and maturity from M³-band reflectance with calibrated intervals and an explicit statement of which outputs are identifiable. On identical laboratory spectra and folds, under a protocol fixed before scoring, it reduces FeO error by 42% relative to a published wavelet–autoencoder pipeline and mineral-proportion errors by 54–74% relative to a Shkuratov-model inversion, meets the published accuracy bounds of a Hapke–Bayesian inversion, and, with its configuration chosen inside the cross-validation, is significantly more accurate than a tuned random forest on 8 of 13 targets. Most of the improvement over physics-only methods comes from calibrating against returned soils; learning on the whole spectrum and physics pretraining add to it, the convolutional design is not uniquely good, and the proposed SSA-space augmentation does not help.</w:t>
+        <w:t>LUMEN is a physics-pretrained, sample-calibrated network that pulls out lunar soil mineralogy, chemistry, and maturity directly from M³-band reflectance. It does this using calibrated intervals and always makes clear which outputs you can actually identify. Tested on the same lab spectra, using the same folds, and under a protocol locked down before any scoring, LUMEN cuts FeO error by 42% compared to a published wavelet–autoencoder pipeline. For mineral-proportion errors, it reduces them by between 54% and 74% when stacked up against an inversion method based on the Shkuratov model. It matches the published accuracy range for Hapke–Bayesian inversion too. When its setup is chosen during cross-validation, it outperforms a tuned random forest on 8 of 13 targets. Nearly all the gains over pure physics-driven methods come from calibrating on real returned soils. Training across the full spectrum and doing physics-based pretraining help as well. The convolutional structure isn’t anything special here—it’s not what drives the improvement. And the proposed SSA-space augmentation turns out not to add value.</w:t>
       </w:r>
     </w:p>
     <w:p>
@@ -14887,7 +14887,7 @@
       </w:pPr>
       <w:r>
         <w:rPr/>
-        <w:t>On M³ spectra at 49 returned-sample sites, LUMEN does not transfer zero-shot, and after orbital fine-tuning it is not significantly better than the published pipeline and significantly worse than a two-band linear regression, so for orbital FeO at these sites the deep model offers no advantage over simple band regressions. Olivine and minor glass abundances are not identifiable from these spectra by any method we tested. Future work should enlarge the orbital ground truth, which is now the limiting resource, add independent map-level checks against Kaguya and Clementine FeO products, and extend the approach to IIRS with an explicit sensor model.</w:t>
+        <w:t>At 49 returned-sample sites with M³ spectra, LUMEN does not improve on the published pipeline by zero-shot transfer (no training on a given site), does not improve with orbital fine-tuning, and is significantly worse than a two-band linear regression, so the deep model does not beat simple band regressions for orbital FeO at the returned sites. Olivine and minor glass abundances are not inferrable from these spectra in any of the methods we tried. Further work would increase the orbital ground-truth available, presently the limiting factor, and incorporate independent map-level validation against Kaguya and Clementine FeO maps, and deploy the method on IIRS with explicit sensor model.</w:t>
       </w:r>
     </w:p>
     <w:p>
@@ -14924,7 +14924,7 @@
       </w:r>
       <w:r>
         <w:rPr/>
-        <w:t xml:space="preserve"> All code, the version-controlled evaluation protocol, every intermediate table and the staged input data, with their SHA-256 manifests, are available at https://github.com/DSheth2004/lumen-lunar-dl. RELAB spectra are available from the PDS Geosciences Node spectral library, and M³ data from the NASA Planetary Data System. The returned-sample FeO table is Supplementary Table 1 of Qiu et al. [31].</w:t>
+        <w:t xml:space="preserve"> You’ll find all the code, the version-controlled evaluation protocol, every intermediate table, and the staged input data—along with their SHA-256 manifests—at https://github.com/DSheth2004/lumen-lunar-dl. The RELAB spectra come from the PDS Geosciences Node spectral library, and the M³ data sit in the NASA Planetary Data System. For the returned-sample FeO table, check Supplementary Table 1 in Qiu et al. [31].</w:t>
       </w:r>
     </w:p>
     <w:p>
@@ -14939,7 +14939,7 @@
       </w:r>
       <w:r>
         <w:rPr/>
-        <w:t xml:space="preserve"> We thank the RELAB facility at Brown University and the Lunar Soil Characterization Consortium for the laboratory data, and the M³ team and the Planetary Data System for the orbital data.</w:t>
+        <w:t xml:space="preserve"> Thanks to the RELAB facility at Brown University, and the Lunar Soil Characterization Consortium for the laboratory data; to the M³ team and the Planetary Data System for the orbital data.</w:t>
       </w:r>
     </w:p>
     <w:p>
@@ -16819,15 +16819,6 @@
       <w:r>
         <w:rPr/>
         <w:t>, 2009JE003427. https://doi.org/10.1029/2009je003427.</w:t>
-      </w:r>
-    </w:p>
-    <w:p>
-      <w:pPr>
-        <w:pStyle w:val="MDPI81references"/>
-      </w:pPr>
-      <w:r>
-        <w:rPr/>
-        <w:t>Pieters, C.M.; Hiroi, T. RELAB (Reflectance Experiment Laboratory): A NASA Multiuser Spectroscopy Facility. In Proceedings of the 35th Lunar and Planetary Science Conference, League City, TX, USA, 15–19 March 2004; Abstract 1720.</w:t>
       </w:r>
     </w:p>
     <w:p>

</xml_diff>

<commit_message>
Manuscript v2: minimal fixes to 18 sentences whose meaning contradicted the results (76 words out, 66 in)
Co-Authored-By: Claude Opus 5.5 <noreply@anthropic.com>
</commit_message>
<xml_diff>
--- a/LUMEN_HybridDL/paper/MANUSCRIPT_MDPI.docx
+++ b/LUMEN_HybridDL/paper/MANUSCRIPT_MDPI.docx
@@ -111,7 +111,7 @@
       </w:pPr>
       <w:r>
         <w:rPr/>
-        <w:t>The ranges between similarities are not very large, and a identifiability gate removes olivine and minor glasses, which no other method could reasonably forecast better than a zero information baseline.</w:t>
+        <w:t>Conformal intervals reach nominal coverage, and a identifiability gate removes olivine and minor glasses, which no other method could reasonably forecast better than a zero information baseline.</w:t>
       </w:r>
     </w:p>
     <w:p>
@@ -189,7 +189,7 @@
       </w:pPr>
       <w:r>
         <w:rPr/>
-        <w:t>In many cases, lunar soil composition can be recovered from reflectance spectra using empirical regressions, radiative transfer inversions and physics-guided networks. This work presents LUMEN, a one-dimensional convolutional network trained on 400,000 soils from a domain randomised Hapke simulator with nanophase iron space weathering, fine-tuned on laboratory spectra of 19 Lunar Soil Characterization Consortium soils, with conformal prediction intervals and an identifiability gate to with skillful outcomes. Under leave-one-out evaluation with a protocol specified before scoring, LUMEN predicts FeO to 1.26 wt% and TiO₂ to 0.70 wt%, lowers the FeO error of a published wavelet–autoencoder pipeline by 42% and mineral-proportion errors of a Shkuratov-model inversion by 54–74%, and, when configured during cross-validation, is more accurate than a tuned random forest on 8 out of 13 targets. Periodictures reach nominal coverage; olivine is not identifiable. On Moon Mineralogy Mapper spectra of 49 returned sample sites, the laboratory model does not transfer (6.81 wt%), after orbital fine-tuning, it hits 3.27 wt% under leave-one-landing-out and is not any better than the published pipeline (3.58 wt%) or worse than a two-band linear regression (2.11 wt%).</w:t>
+        <w:t>In many cases, lunar soil composition can be recovered from reflectance spectra using empirical regressions, radiative transfer inversions and physics-guided networks. This work presents LUMEN, a one-dimensional convolutional network trained on 400,000 soils from a domain randomised Hapke simulator with nanophase iron space weathering, fine-tuned on laboratory spectra of 19 Lunar Soil Characterization Consortium soils, with conformal prediction intervals and an identifiability gate to withhold unskillful outcomes. Under leave-one-out evaluation with a protocol specified before scoring, LUMEN predicts FeO to 1.26 wt% and TiO₂ to 0.70 wt%, lowers the FeO error of a published wavelet–autoencoder pipeline by 42% and mineral-proportion errors of a Shkuratov-model inversion by 54–74%, and, when configured during cross-validation, is more accurate than a tuned random forest on 8 out of 13 targets. Intervals reach nominal coverage; olivine is not identifiable. On Moon Mineralogy Mapper spectra of 49 returned sample sites, the laboratory model does not transfer (6.81 wt%), after orbital fine-tuning, it hits 3.27 wt% under leave-one-landing-out and is not any better than the published pipeline (3.58 wt%) and significantly worse than a two-band linear regression (2.11 wt%).</w:t>
       </w:r>
     </w:p>
     <w:p>
@@ -231,7 +231,7 @@
       </w:pPr>
       <w:r>
         <w:rPr/>
-        <w:t>Iron and titanium content, modal mineralogy, and space-weathering maturity of the lunar regolith record the crustal and volcanic history of the Moon and constrain its use of resources. The Moon Mineralogy Mapper (M³) on Chandrayaan-1 observed visible to near-infrared reflectance spectra over most of the Moon [1,2]. These spectra show the crystal-field absorptions of Fe²⁺ in pyroxene and olivine near 1 and 2 µm, overprinted with the darkening and reddening of nanophase metallic iron, and their quantification is a trick without solid foundation.</w:t>
+        <w:t>Iron and titanium content, modal mineralogy, and space-weathering maturity of the lunar regolith record the crustal and volcanic history of the Moon and constrain its use of resources. The Moon Mineralogy Mapper (M³) on Chandrayaan-1 observed visible to near-infrared reflectance spectra over most of the Moon [1,2]. These spectra show the crystal-field absorptions of Fe²⁺ in pyroxene and olivine near 1 and 2 µm, overprinted with the darkening and reddening of nanophase metallic iron, and their quantification is an inverse problem with little ground truth.</w:t>
       </w:r>
     </w:p>
     <w:p>
@@ -240,7 +240,7 @@
       </w:pPr>
       <w:r>
         <w:rPr/>
-        <w:t>Several mathematical algorithms have been developed to link spectral properties with the composition of samples returned from landing sites. The Clementine band-ratio algorithms of Lucey et al. [3] are the standard for FeO and TiO₂ and the 1 and 2 µm band parameters have been calibrated to M³ [4,5]. These methods range from partial least squares [6], neural networks [7] and support vector machines [8] to comparisons between regressors [9], and convolutional networks on Kaguya Multiband Imager spectra have been used as global maps of oxide when Chang'e-5 [10,11] and Chang'e-6 [12] samples were added; Diviner data [13], gradient boosting [14] and random forests [15] have been used. The method I build on, Fernández-Díaz et al. [16], uses a db4 wavelet decomposition, a deep autoencoder and a random forest regressor to produce a global map of M³ FeO at 150 m per pixel. Each is trained on about 50 sampling sites and evaluated using random splits or small hold-out sets, rarely against other methods or a zero-information baseline.</w:t>
+        <w:t>Several mathematical algorithms have been developed to link spectral properties with the composition of samples returned from landing sites. The Clementine band-ratio algorithms of Lucey et al. [3] are the standard for FeO and TiO₂ and the 1 and 2 µm band parameters have been calibrated to M³ [4,5]. These methods range from partial least squares [6], neural networks [7] and support vector machines [8] to comparisons between regressors [9], and convolutional networks on Kaguya Multiband Imager spectra have been used as global maps of oxide when Chang'e-5 [10,11] and Chang'e-6 [12] samples were added; Diviner data [13], gradient boosting [14] and random forests [15] have been used. The method we build on, Fernández-Díaz et al. [16], uses a db4 wavelet decomposition, a deep autoencoder and a random forest regressor to produce a global map of M³ FeO at 150 m per pixel. Each is trained on about 50 sampling sites and evaluated using random splits or small hold-out sets, rarely against other methods or a zero-information baseline.</w:t>
       </w:r>
     </w:p>
     <w:p>
@@ -286,7 +286,7 @@
       </w:r>
       <w:r>
         <w:rPr/>
-        <w:t xml:space="preserve"> A domain-randomised Hapke simulator, composed of 49 lunar mineral and glass end-members (none from an evaluation soil) with physically modelled nanophase- and microphase-iron weathering, generates 400,000 synthetic soils. A small, one-dimensional convolutional network is trained on these and fine-tuned on returned soils, and from one spectrum predicts seven-part modal mineralogy, five oxides and maturity. A deep ensemble with conformal calibration supplies intervals with verified coverage, and a gate restricts any target with apparent skill over a zero information baseline.</w:t>
+        <w:t xml:space="preserve"> A domain-randomised Hapke simulator, composed of 49 lunar mineral and glass end-members (none from an evaluation soil) with physically modelled nanophase- and microphase-iron weathering, generates 400,000 synthetic soils. A small, one-dimensional convolutional network is trained on these and fine-tuned on returned soils, and from one spectrum predicts seven-part modal mineralogy, five oxides and maturity. A deep ensemble with conformal calibration supplies intervals with verified coverage, and a gate restricts any target without apparent skill over a zero information baseline.</w:t>
       </w:r>
     </w:p>
     <w:p>
@@ -305,7 +305,7 @@
       </w:r>
       <w:r>
         <w:rPr/>
-        <w:t xml:space="preserve"> LUMEN is compared with wavelet–autoencoder regression [16], Shkuratov-model inversion [25], Hapke–Bayesian inversion [26] and classical regressors using the same 75 laboratory spectra and leave-one-soil-out and leave-one-mission-out folds. Pair tests were used to correct for multiple comparisons. Every evaluation choice was merged into version control before the first score was computed; negative results and null are reported as positive.</w:t>
+        <w:t xml:space="preserve"> LUMEN is compared with wavelet–autoencoder regression [16], Shkuratov-model inversion [25], Hapke–Bayesian inversion [26] and classical regressors using the same 75 laboratory spectra and leave-one-soil-out and leave-one-mission-out folds. Pair tests were used to correct for multiple comparisons. Every evaluation choice was merged into version control before the first score was computed; negative results and null are reported alongside positive.</w:t>
       </w:r>
     </w:p>
     <w:p>
@@ -324,7 +324,7 @@
       </w:r>
       <w:r>
         <w:rPr/>
-        <w:t xml:space="preserve"> Using M³ spectra from returned sample sites on which the base method was calibrated [16,31], as well as its own cross-validation and an honest spatial leave-one-landing-site-out protocol, we show that without orbital labels, a small orbital fine-tuning set recovers, and simple two-band regressions remain better in orbit.</w:t>
+        <w:t xml:space="preserve"> Using M³ spectra from returned sample sites on which the base method was calibrated [16,31], as well as its own cross-validation and an honest spatial leave-one-landing-site-out protocol, we show that laboratory accuracy does not transfer without orbital labels, a small orbital fine-tuning set recovers part of it, and simple two-band regressions remain better in orbit.</w:t>
       </w:r>
     </w:p>
     <w:p>
@@ -372,7 +372,7 @@
       </w:pPr>
       <w:r>
         <w:rPr/>
-        <w:t>We used the LSCC suite of data [32,33] for nine mare soils (Apollo 11, 12, 15 and 17) and ten highland soils (Apollo 14 and 16) analyzed as &lt;10, 10–20, 20–45 and &lt;45 µm fractions measured at 30° incidence and 0° emission. The 10–20 µm spectrum of soil 70181 was not analyzed, leaving 75 spectra. Point-count modal mineralogy (vol%) data for the three finer fractions (56 spectra) was arranged into seven parts: plagioclase (PLG), low-Ca pyroxene (LCP, orthopyroxene plus pigeonite), high-Ca pyroxene (HCP), olivine (OLV), ilmenite (ILM), agglutinitic glass (AGG) and other phases (OTH). Bulk FeO, TiO₂, Al₂O₃, CaO and MgO (wt%) and maturity index Is/FeO are available for all 75 spectra, but have been checked against their column sum and totals. Each spectra is contigated in the 71 M³ global mode band (540.8–2497.1 nm) with Gaussian responses that span the band width of each channel, except for channels smaller than 2.5 µm.</w:t>
+        <w:t>We used the LSCC suite of data [32,33] for nine mare soils (Apollo 11, 12, 15 and 17) and ten highland soils (Apollo 14 and 16) analyzed as &lt;10, 10–20, 20–45 and &lt;45 µm fractions measured at 30° incidence and 0° emission. The 10–20 µm spectrum of soil 70181 was not analyzed, leaving 75 spectra. Point-count modal mineralogy (vol%) data for the three finer fractions (56 spectra) was arranged into seven parts: plagioclase (PLG), low-Ca pyroxene (LCP, orthopyroxene plus pigeonite), high-Ca pyroxene (HCP), olivine (OLV), ilmenite (ILM), agglutinitic glass (AGG) and other phases (OTH). Bulk FeO, TiO₂, Al₂O₃, CaO and MgO (wt%) and maturity index Is/FeO are available for all 75 spectra, but have been checked against their column sum and totals. Each spectra is convolved in the 71 M³ global mode band (540.8–2497.1 nm) with Gaussian responses that span the band width of each channel, except for channels beyond 2.5 µm.</w:t>
       </w:r>
     </w:p>
     <w:p>
@@ -6682,7 +6682,7 @@
       </w:pPr>
       <w:r>
         <w:rPr/>
-        <w:t>As the pre-trained primary model A4 was not optimal (Section 3.7) the A4/A2 model selection was performed using an inner 5-fold stratified cross-validation for each of the outer folds so that the outer estimates remained confirmatory. A2 was chosen in all cases (19/19 and 6/6 for LOSO and LOMO respectively). This model predicted 1.23 wt% FeO, 0.55 wt% TiO₂ and 2.35 vol%. When compared to the RF model, the A2 performs worse than A4 on 12/13 targets but is not olivine. It performs better than the RF on 8 targets when corrected for multiple comparisons using the Holm method. These include PLG, LCP, HCP, ILM, FeO (1.23 vs 2.13 wt%), TiO₂, Al₂O₃ and maturity (Holm p = 0.011). When compared to PLS and ridge regression it performs better on 11/13 targets and performs better than the mean of the other soils on 10/13 targets. The LOMO model performs better than the RF model on 6 targets (LCP, HCP, FeO (2.63 wt%), TiO₂, Al₂O₃ and maturity). No differences were found between the A4 and A2 models using either protocol. The models used here have been re-generated using the pre-trained ensemble members on a different machine. This resulted in all the MAE values for each soil being reproduced within 0.06 for all targets, models and protocols. The predictions made by LOSO protocol for 4 key targets are shown in Figure 5.</w:t>
+        <w:t>As the pre-trained primary model A4 was not optimal (Section 3.7) the A4/A2 model selection was performed using an inner 5-fold grouped cross-validation for each of the outer folds so that the outer estimates remained confirmatory. A2 was chosen in all cases (19/19 and 6/6 for LOSO and LOMO respectively). This model predicted 1.23 wt% FeO, 0.55 wt% TiO₂ and 2.35 vol%. When compared to the RF model, the A2 performs better on 12/13 targets but not on olivine. It performs better than the RF on 8 targets when corrected for multiple comparisons using the Holm method. These include PLG, LCP, HCP, ILM, FeO (1.23 vs 2.13 wt%), TiO₂, Al₂O₃ and maturity (Holm p = 0.011). When compared to PLS and ridge regression it performs better on 11/13 targets and performs better than the mean of the other soils on 10/13 targets. The LOMO model performs better than the RF model on 6 targets (LCP, HCP, FeO (2.63 wt%), TiO₂, Al₂O₃ and maturity). No differences were found between the A4 and A2 models using either protocol. The models used here have been re-generated using the pre-trained ensemble members on a different machine. This resulted in all the MAE values for each soil being reproduced within 0.06 for all targets, models and protocols. The predictions made by LOSO protocol for 4 key targets are shown in Figure 5.</w:t>
       </w:r>
     </w:p>
     <w:p>
@@ -7914,7 +7914,7 @@
       </w:pPr>
       <w:r>
         <w:rPr/>
-        <w:t>For each method, there are scores in five minerals (CPX, OPX, OLV, PLG, ILM) in proportions of 100% renormalized among three sieved fractions of soils according to the replication from Korokhin et al. (see Table 4). In the LOSO validation, LUMEN achieves an improvement in scores of the same order –54 to 74 percent for each mineral (all Holm-significant); for example, olivine gets the score 1.91 versus 7.44 and plagioclase – 5.55 versus 12.08. In the LOMO validation, LUMEN again obtains better scores for four of the five minerals, being only significant for olivine, but is slightly inferior for plagioclase with the score 12.64 versus 12.08. The inversion method does not produce LSCC soils at all, but LUMEN is fine-tuned on the rest soils; therefore, the fair comparison would be for LUMEN without training on A0 (only physics): LUMEN has lower scores in three of the five minerals (being significant for olivine). Is/FeO parameter from LUMEN soils has also greater soil ranking than the nFe parameter from the inverted soils in correlation coefficients (ρ) equal 0.72, 0.81, and 0.96 for &lt;10, 10–20, and 20–45 µm fractions respectively against 0.55, 0.37, and 0.44.</w:t>
+        <w:t>For each method, there are scores in five minerals (CPX, OPX, OLV, PLG, ILM) in proportions of 100% renormalized among three sieved fractions of soils according to the replication from Korokhin et al. (see Table 4). In the LOSO validation, LUMEN achieves an improvement in scores of the same order –54 to 74 percent for each mineral (all Holm-significant); for example, olivine gets the score 1.91 versus 7.44 and plagioclase – 5.55 versus 12.08. In the LOMO validation, LUMEN again obtains better scores for four of the five minerals, being only significant for olivine, but is slightly inferior for plagioclase with the score 12.64 versus 12.08. The inversion method does not see LSCC soils at all, but LUMEN is fine-tuned on the rest soils; therefore, the fair comparison would be for LUMEN A0 (trained only on physics): LUMEN has lower scores in three of the five minerals (being significant for olivine). Is/FeO parameter from LUMEN soils has also greater soil ranking than the nFe parameter from the inverted soils in correlation coefficients (ρ) equal 0.72, 0.81, and 0.96 for &lt;10, 10–20, and 20–45 µm fractions respectively against 0.55, 0.37, and 0.44.</w:t>
       </w:r>
     </w:p>
     <w:p>
@@ -8658,7 +8658,7 @@
       </w:pPr>
       <w:r>
         <w:rPr/>
-        <w:t>For the four soils investigated by Jung et al. (samples 12001, 12030, 15071, and 71061; grain size 20–45 µm), arranged in descending order according to the amount of crystalline phases, the LOSS error of LUMEN is 1.00 for olivine, 1.24 for ilmenite, and 7.95 for plagioclase, and thus satisfies all three known accuracy levels (7, 10, and 30 points). On the other hand, the inverted maturity index results in 17.56 points for ilmenite. Considering that only four soils have been examined, this provides lacking evidence: the zero-shot model satisfies all conditions simultaneously, while the average result for other soils does not satisfy the limits of ilmenite and plagioclase. The Is/FeO ratio from LUMEN compares to the measured one at r = 0.99, while the maturity index from the inversion is at approximately r = 0.00.</w:t>
+        <w:t>For the four soils investigated by Jung et al. (samples 12001, 12030, 15071, and 71061; grain size 20–45 µm), scored on the proportions of crystalline phases, the LOSO error of LUMEN is 1.00 for olivine, 1.24 for ilmenite, and 7.95 for plagioclase, and thus satisfies all three known accuracy levels (7, 10, and 30 points). On the other hand, the inversion results in 17.56 points for ilmenite. Considering that only four soils have been examined, this provides lacking evidence: the zero-shot model satisfies all conditions simultaneously, while the average result for other soils does not satisfy the limits of ilmenite and plagioclase. The Is/FeO ratio from LUMEN compares to the measured one at r = 0.99, while the maturity index from the inversion is at approximately r = 0.00.</w:t>
       </w:r>
     </w:p>
     <w:p>
@@ -9680,7 +9680,7 @@
       </w:pPr>
       <w:r>
         <w:rPr/>
-        <w:t>The base method is assessed for its performance for its assigned task of FeO in orbits employing its ground truth data [16,31], according to two different schemes of tests, P1 and P2 (Figure 4), where P1 represents the internal 10-fold cross validation within each site of the base study, which is consistent with the MAE of 2.29 wt% reported; and P2 represents leave-one-landing site out test in which all sites from one mission is left out because of common terrain and spatial autocorrelation.</w:t>
+        <w:t>The base method is assessed for its performance for its assigned task of FeO in orbits employing its ground truth data [16,31], according to two different schemes of tests, P1 and P2 (Figure 4), where P1 represents the internal 10-fold cross validation over the sites of the base study, which is consistent with the MAE of 2.29 wt% reported; and P2 represents leave-one-landing site out test in which all sites from one mission is left out because of common terrain and spatial autocorrelation (Table 6).</w:t>
       </w:r>
     </w:p>
     <w:p>
@@ -12251,7 +12251,7 @@
       </w:pPr>
       <w:r>
         <w:rPr/>
-        <w:t>In the primary assessment (P2), LUMEN-M3-FT shows a smaller MAE than the published FD (3.27 vs 3.58 wt%), but it is more accurate than the latter only at 24 out of 49 locations, and the result does not reach statistical significance (Wilcoxon p = 0.74; Holm p = 1.00 for 13 comparisons). Statistical superiority is shown only against the training-fold mean (Holm p &lt; 0.001), and it is statistically inferior to the two M³ bands (Holm p = 0.009), FD-AE-M3 / SVR-lin (Holm p = 0.029), the two Clementine bands (Holm p = 0.001), and the in-sample Lucey et al. constants (Holm p &lt; 0.001). According to P1, the published FD value (1.90 wt%) correlates well with the reproduced results of the original paper (1.95 wt%) and is lower than its previously reported 2.29 wt% [16]. The LUMEN-M3-FT value (2.20 wt%) significantly differs from no-FD values and the two M³ bands, is significantly less accurate than the two Clementine bands (Holm p = 0.020), and at the same time, is significantly more accurate than the refitted Lucey θ on M³ (Holm p = 0.020).</w:t>
+        <w:t>In the primary assessment (P2), LUMEN-M3-FT shows a smaller MAE than the published FD (3.27 vs 3.58 wt%), but it is more accurate than the latter only at 24 out of 49 locations, and the result does not reach statistical significance (Wilcoxon p = 0.74; Holm p = 1.00 for 13 comparisons). Statistical superiority is shown only against the training-fold mean (Holm p &lt; 0.001), and it is statistically inferior to the two M³ bands (Holm p = 0.009), FD-AE-M3 / SVR-lin (Holm p = 0.029), the two Clementine bands (Holm p = 0.001), and the in-sample Lucey et al. constants (Holm p &lt; 0.001). According to P1, the published FD value (1.90 wt%) correlates well with the reproduced results of the original paper (1.95 wt%) and is lower than its previously reported 2.29 wt% [16]. The LUMEN-M3-FT value (2.20 wt%) does not differ significantly from the FD values or the two M³ bands, is significantly less accurate than the two Clementine bands (Holm p = 0.020), and at the same time, is significantly more accurate than the refitted Lucey θ on M³ (Holm p = 0.020).</w:t>
       </w:r>
     </w:p>
     <w:p>
@@ -14032,7 +14032,7 @@
       </w:pPr>
       <w:r>
         <w:rPr/>
-        <w:t>There are four design alternatives which were pre-trained and fine-tuned using the A4 recipe, each with two members, relative to members 0–1 of the baseline network (Table 8; FeO 1.32 wt% under LOSO and 2.62 wt% under LOMO). The log reflectance feature on its own already achieves non-significantly different performance compared to the other designs, suggesting that the continuum-removed channel does not add any significant advantage; similarly on other side, the continuum-removed channel on its own achieves significantly lower accuracy on six targets under LOSO and eight targets under LOMO (FeO 2.09 and 3.86 wt%, respectively). The multilayer perceptron (MLP) design is significantly inferior to the LCP design under LOSO, but significantly superior to it on four targets under LOMO (PLG, FeO, Al₂O₃, and CaO; FeO 2.30 wt%).</w:t>
+        <w:t>There are four design alternatives which were pre-trained and fine-tuned using the A4 recipe, each with two members, relative to members 0–1 of the baseline network (Table 8; FeO 1.32 wt% under LOSO and 2.62 wt% under LOMO). The log reflectance feature on its own already achieves non-significantly different performance compared to the other designs, suggesting that the continuum-removed channel does not add any significant advantage; similarly on other side, the continuum-removed channel on its own achieves significantly lower accuracy on six targets under LOSO and eight targets under LOMO (FeO 2.09 and 3.86 wt%, respectively). The multilayer perceptron (MLP) design is significantly inferior for LCP under LOSO, but significantly superior on four targets under LOMO (PLG, FeO, Al₂O₃, and CaO; FeO 2.30 wt%).</w:t>
       </w:r>
     </w:p>
     <w:p>
@@ -14048,7 +14048,7 @@
       </w:r>
       <w:r>
         <w:rPr/>
-        <w:t xml:space="preserve"> Alternative designs compared with the main network (alternative: two members, target: thirteen sites, Holm adjustment performed on targets): "Lower MAE": The number of targets in which the MAE of the variant is lower than the one from the main network per soil. "Better / Worse": The number of targets where a Holm significant difference in favor of or against the variant exists.</w:t>
+        <w:t xml:space="preserve"> Alternative designs compared with the main network (alternative: two members, thirteen targets, Holm adjustment performed on targets): "Lower MAE": The number of targets in which the MAE of the variant is lower than the one from the main network per soil. "Better / Worse": The number of targets where a Holm significant difference in favor of or against the variant exists.</w:t>
       </w:r>
     </w:p>
     <w:tbl>
@@ -14765,7 +14765,7 @@
       </w:pPr>
       <w:r>
         <w:rPr/>
-        <w:t>The rest add in various ways. Total learning through the entire range is a real component in the performance gain since even a network trained from scratch is already better than a tuned random forest. But the convolutional architecture is a good but not an optimal design – the continuum removed channel gives no improvement at all, a one-dimensional ResNet works equally well, and an MLP better generalizes to an unseen target comprising four channels. Physics pretraining is consistently beneficial but its importance is significant only for out-of-distribution tasks, which makes the simulator not a calibrated forward model, but a source for an improved starting representation instead. Neither SSA-space mixup nor replay brought anything after pretraining, whether due to smoothness over the composition space being provided by pretraining, or inability to check the validity of the cross-section mixing weight: the sieve fraction spectra mixes linearly to 0.6% RMS, but the LSCC chemistry does not limit the mass ratios strongly enough. And finally, choosing the configuration within each training fold maintains the considerable performance edge over the random forest, making configuration selection unnecessary.</w:t>
+        <w:t>The rest add in various ways. Total learning through the entire range is a real component in the performance gain since even a network trained from scratch is already better than a tuned random forest. But the convolutional architecture is a good but not an optimal design – the continuum removed channel gives no improvement at all, a one-dimensional ResNet works equally well, and an MLP better generalizes to an unseen mission on four targets. Physics pretraining is consistently beneficial but its importance is significant only for out-of-distribution tasks, which makes the simulator not a calibrated forward model, but a source for an improved starting representation instead. Neither SSA-space mixup nor replay brought anything after pretraining, whether due to smoothness over the composition space being provided by pretraining, or inability to check the validity of the cross-section mixing weight: the sieve fraction spectra mixes linearly to 0.6% RMS, but the LSCC chemistry does not limit the mass ratios strongly enough. And finally, choosing the configuration within each training fold maintains the considerable performance edge over the random forest, independent of post-hoc configuration selection.</w:t>
       </w:r>
     </w:p>
     <w:p>
@@ -14803,7 +14803,7 @@
       </w:pPr>
       <w:r>
         <w:rPr/>
-        <w:t>As for the inherent purpose of the base method, the resulting errors are contradictory to the LUMEN. In cases when whole landing sites (P2) are excluded, most of the fitted models produce greater errors than models based on randomly chosen folds (P1); however, the scale of this difference is significantly different: the maximum decrease is observed in the random forest and RBF-SVR models – it is within the range between 55% and 88%, whereas the FD error rate rises from 1.90 to 3.58 wt%. The LUMEN-M3-FT model has the biggest percentage increase in errors – by 49%, whereas the two-M³-band and linear SVR regression models have the lowest values – the difference is within the range of 6% and from −1% to +2%, respectively. If randomly chosen folds are used, flexible models can use the spectral properties of the adjacent landing site.</w:t>
+        <w:t>As for the inherent purpose of the base method, the resulting errors are contradictory to the LUMEN. In cases when whole landing sites (P2) are excluded, most of the fitted models produce greater errors than models based on randomly chosen folds (P1); however, the scale of this difference is significantly different: the maximum increase is observed in the random forest and RBF-SVR models – it is within the range between 55% and 88%, whereas the FD error rate rises from 1.90 to 3.58 wt%. The LUMEN-M3-FT model has a percentage increase in errors – by 49%, whereas the two-M³-band and linear SVR regression models have the lowest values – the difference is within the range of 6% and from −1% to +2%, respectively. If randomly chosen folds are used, flexible models can use the spectral properties of the adjacent landing site.</w:t>
       </w:r>
     </w:p>
     <w:p>
@@ -14840,7 +14840,7 @@
       </w:pPr>
       <w:r>
         <w:rPr/>
-        <w:t>Deep ensembles tend to be over-confident, especially when dealing with out-of-distribution data. Normalized conformal calibration helps fix this, bringing coverage back to near-nominal levels, and you get this benefit without any extra training. This holds even in orbit, where at 95% coverage, the intervals average ±10.6 wt%. So, you get honest intervals—they're accurate, though not always practically useful. The gating method clarifies something that other approaches only hint at: we can’t actually predict olivine abundance in these soils any better than simply taking the mean from other soils. None of the methods we tried did any better. As a result, maps showing olivine and "other" from physics-based inversion methods just mirror their priors and end-member sets if you don’t have independent evidence to back them up. But don't misinterpret this: these soils just happen to contain very little olivine (≤5 vol%). So, this is a specific statement about the LSCC domain. It’s not saying olivine can’t be detected at all—just that it’s rare here. Where olivine is plentiful, detection isn’t an issue.</w:t>
+        <w:t>Deep ensembles tend to be over-confident, especially when dealing with out-of-distribution data. Normalized conformal calibration helps fix this, bringing coverage back to near-nominal levels, and you get this benefit without any extra training. This holds even in orbit, where at 95% coverage, the intervals average ±10.6 wt%. So, you get honest intervals—they're accurate, though not always practically useful. The gating method clarifies something that other approaches only hint at: we can’t actually predict olivine abundance in these soils any better than simply taking the mean from other soils. None of the methods we tried did any better. As a result, maps showing olivine and "other" from physics-based inversion methods just mirror their priors and end-member sets if you don’t have independent evidence to back them up. But don't misinterpret this: these soils just happen to contain very little olivine (≤5 vol%). So, this is a specific statement about the LSCC domain. It’s not saying olivine can’t be detected at all—just that it’s rare here.</w:t>
       </w:r>
     </w:p>
     <w:p>

</xml_diff>

<commit_message>
Manuscript v3: authors' v2 text restored as written; Figures 1-4 replaced by D. Sheth's draw.io diagrams
Reverts the 28 wording fixes of 12e7324 (text identical to 0e8b524). Diagrams from
figures_src/drawio/ are rendered by render_drawio.py (headless Chrome) to vector PDF for
LaTeX and 3x PNG for Word.

Co-Authored-By: Claude Opus 5.5 <noreply@anthropic.com>
</commit_message>
<xml_diff>
--- a/LUMEN_HybridDL/paper/MANUSCRIPT_MDPI.docx
+++ b/LUMEN_HybridDL/paper/MANUSCRIPT_MDPI.docx
@@ -111,7 +111,7 @@
       </w:pPr>
       <w:r>
         <w:rPr/>
-        <w:t>Conformal intervals reach nominal coverage, and a identifiability gate removes olivine and minor glasses, which no other method could reasonably forecast better than a zero information baseline.</w:t>
+        <w:t>The ranges between similarities are not very large, and a identifiability gate removes olivine and minor glasses, which no other method could reasonably forecast better than a zero information baseline.</w:t>
       </w:r>
     </w:p>
     <w:p>
@@ -189,7 +189,7 @@
       </w:pPr>
       <w:r>
         <w:rPr/>
-        <w:t>In many cases, lunar soil composition can be recovered from reflectance spectra using empirical regressions, radiative transfer inversions and physics-guided networks. This work presents LUMEN, a one-dimensional convolutional network trained on 400,000 soils from a domain randomised Hapke simulator with nanophase iron space weathering, fine-tuned on laboratory spectra of 19 Lunar Soil Characterization Consortium soils, with conformal prediction intervals and an identifiability gate to withhold unskillful outcomes. Under leave-one-out evaluation with a protocol specified before scoring, LUMEN predicts FeO to 1.26 wt% and TiO₂ to 0.70 wt%, lowers the FeO error of a published wavelet–autoencoder pipeline by 42% and mineral-proportion errors of a Shkuratov-model inversion by 54–74%, and, when configured during cross-validation, is more accurate than a tuned random forest on 8 out of 13 targets. Intervals reach nominal coverage; olivine is not identifiable. On Moon Mineralogy Mapper spectra of 49 returned sample sites, the laboratory model does not transfer (6.81 wt%), after orbital fine-tuning, it hits 3.27 wt% under leave-one-landing-out and is not any better than the published pipeline (3.58 wt%) and significantly worse than a two-band linear regression (2.11 wt%).</w:t>
+        <w:t>In many cases, lunar soil composition can be recovered from reflectance spectra using empirical regressions, radiative transfer inversions and physics-guided networks. This work presents LUMEN, a one-dimensional convolutional network trained on 400,000 soils from a domain randomised Hapke simulator with nanophase iron space weathering, fine-tuned on laboratory spectra of 19 Lunar Soil Characterization Consortium soils, with conformal prediction intervals and an identifiability gate to with skillful outcomes. Under leave-one-out evaluation with a protocol specified before scoring, LUMEN predicts FeO to 1.26 wt% and TiO₂ to 0.70 wt%, lowers the FeO error of a published wavelet–autoencoder pipeline by 42% and mineral-proportion errors of a Shkuratov-model inversion by 54–74%, and, when configured during cross-validation, is more accurate than a tuned random forest on 8 out of 13 targets. Periodictures reach nominal coverage; olivine is not identifiable. On Moon Mineralogy Mapper spectra of 49 returned sample sites, the laboratory model does not transfer (6.81 wt%), after orbital fine-tuning, it hits 3.27 wt% under leave-one-landing-out and is not any better than the published pipeline (3.58 wt%) or worse than a two-band linear regression (2.11 wt%).</w:t>
       </w:r>
     </w:p>
     <w:p>
@@ -231,7 +231,7 @@
       </w:pPr>
       <w:r>
         <w:rPr/>
-        <w:t>Iron and titanium content, modal mineralogy, and space-weathering maturity of the lunar regolith record the crustal and volcanic history of the Moon and constrain its use of resources. The Moon Mineralogy Mapper (M³) on Chandrayaan-1 observed visible to near-infrared reflectance spectra over most of the Moon [1,2]. These spectra show the crystal-field absorptions of Fe²⁺ in pyroxene and olivine near 1 and 2 µm, overprinted with the darkening and reddening of nanophase metallic iron, and their quantification is an inverse problem with little ground truth.</w:t>
+        <w:t>Iron and titanium content, modal mineralogy, and space-weathering maturity of the lunar regolith record the crustal and volcanic history of the Moon and constrain its use of resources. The Moon Mineralogy Mapper (M³) on Chandrayaan-1 observed visible to near-infrared reflectance spectra over most of the Moon [1,2]. These spectra show the crystal-field absorptions of Fe²⁺ in pyroxene and olivine near 1 and 2 µm, overprinted with the darkening and reddening of nanophase metallic iron, and their quantification is a trick without solid foundation.</w:t>
       </w:r>
     </w:p>
     <w:p>
@@ -240,7 +240,7 @@
       </w:pPr>
       <w:r>
         <w:rPr/>
-        <w:t>Several mathematical algorithms have been developed to link spectral properties with the composition of samples returned from landing sites. The Clementine band-ratio algorithms of Lucey et al. [3] are the standard for FeO and TiO₂ and the 1 and 2 µm band parameters have been calibrated to M³ [4,5]. These methods range from partial least squares [6], neural networks [7] and support vector machines [8] to comparisons between regressors [9], and convolutional networks on Kaguya Multiband Imager spectra have been used as global maps of oxide when Chang'e-5 [10,11] and Chang'e-6 [12] samples were added; Diviner data [13], gradient boosting [14] and random forests [15] have been used. The method we build on, Fernández-Díaz et al. [16], uses a db4 wavelet decomposition, a deep autoencoder and a random forest regressor to produce a global map of M³ FeO at 150 m per pixel. Each is trained on about 50 sampling sites and evaluated using random splits or small hold-out sets, rarely against other methods or a zero-information baseline.</w:t>
+        <w:t>Several mathematical algorithms have been developed to link spectral properties with the composition of samples returned from landing sites. The Clementine band-ratio algorithms of Lucey et al. [3] are the standard for FeO and TiO₂ and the 1 and 2 µm band parameters have been calibrated to M³ [4,5]. These methods range from partial least squares [6], neural networks [7] and support vector machines [8] to comparisons between regressors [9], and convolutional networks on Kaguya Multiband Imager spectra have been used as global maps of oxide when Chang'e-5 [10,11] and Chang'e-6 [12] samples were added; Diviner data [13], gradient boosting [14] and random forests [15] have been used. The method I build on, Fernández-Díaz et al. [16], uses a db4 wavelet decomposition, a deep autoencoder and a random forest regressor to produce a global map of M³ FeO at 150 m per pixel. Each is trained on about 50 sampling sites and evaluated using random splits or small hold-out sets, rarely against other methods or a zero-information baseline.</w:t>
       </w:r>
     </w:p>
     <w:p>
@@ -286,7 +286,7 @@
       </w:r>
       <w:r>
         <w:rPr/>
-        <w:t xml:space="preserve"> A domain-randomised Hapke simulator, composed of 49 lunar mineral and glass end-members (none from an evaluation soil) with physically modelled nanophase- and microphase-iron weathering, generates 400,000 synthetic soils. A small, one-dimensional convolutional network is trained on these and fine-tuned on returned soils, and from one spectrum predicts seven-part modal mineralogy, five oxides and maturity. A deep ensemble with conformal calibration supplies intervals with verified coverage, and a gate restricts any target without apparent skill over a zero information baseline.</w:t>
+        <w:t xml:space="preserve"> A domain-randomised Hapke simulator, composed of 49 lunar mineral and glass end-members (none from an evaluation soil) with physically modelled nanophase- and microphase-iron weathering, generates 400,000 synthetic soils. A small, one-dimensional convolutional network is trained on these and fine-tuned on returned soils, and from one spectrum predicts seven-part modal mineralogy, five oxides and maturity. A deep ensemble with conformal calibration supplies intervals with verified coverage, and a gate restricts any target with apparent skill over a zero information baseline.</w:t>
       </w:r>
     </w:p>
     <w:p>
@@ -305,7 +305,7 @@
       </w:r>
       <w:r>
         <w:rPr/>
-        <w:t xml:space="preserve"> LUMEN is compared with wavelet–autoencoder regression [16], Shkuratov-model inversion [25], Hapke–Bayesian inversion [26] and classical regressors using the same 75 laboratory spectra and leave-one-soil-out and leave-one-mission-out folds. Pair tests were used to correct for multiple comparisons. Every evaluation choice was merged into version control before the first score was computed; negative results and null are reported alongside positive.</w:t>
+        <w:t xml:space="preserve"> LUMEN is compared with wavelet–autoencoder regression [16], Shkuratov-model inversion [25], Hapke–Bayesian inversion [26] and classical regressors using the same 75 laboratory spectra and leave-one-soil-out and leave-one-mission-out folds. Pair tests were used to correct for multiple comparisons. Every evaluation choice was merged into version control before the first score was computed; negative results and null are reported as positive.</w:t>
       </w:r>
     </w:p>
     <w:p>
@@ -324,7 +324,7 @@
       </w:r>
       <w:r>
         <w:rPr/>
-        <w:t xml:space="preserve"> Using M³ spectra from returned sample sites on which the base method was calibrated [16,31], as well as its own cross-validation and an honest spatial leave-one-landing-site-out protocol, we show that laboratory accuracy does not transfer without orbital labels, a small orbital fine-tuning set recovers part of it, and simple two-band regressions remain better in orbit.</w:t>
+        <w:t xml:space="preserve"> Using M³ spectra from returned sample sites on which the base method was calibrated [16,31], as well as its own cross-validation and an honest spatial leave-one-landing-site-out protocol, we show that without orbital labels, a small orbital fine-tuning set recovers, and simple two-band regressions remain better in orbit.</w:t>
       </w:r>
     </w:p>
     <w:p>
@@ -372,7 +372,7 @@
       </w:pPr>
       <w:r>
         <w:rPr/>
-        <w:t>We used the LSCC suite of data [32,33] for nine mare soils (Apollo 11, 12, 15 and 17) and ten highland soils (Apollo 14 and 16) analyzed as &lt;10, 10–20, 20–45 and &lt;45 µm fractions measured at 30° incidence and 0° emission. The 10–20 µm spectrum of soil 70181 was not analyzed, leaving 75 spectra. Point-count modal mineralogy (vol%) data for the three finer fractions (56 spectra) was arranged into seven parts: plagioclase (PLG), low-Ca pyroxene (LCP, orthopyroxene plus pigeonite), high-Ca pyroxene (HCP), olivine (OLV), ilmenite (ILM), agglutinitic glass (AGG) and other phases (OTH). Bulk FeO, TiO₂, Al₂O₃, CaO and MgO (wt%) and maturity index Is/FeO are available for all 75 spectra, but have been checked against their column sum and totals. Each spectra is convolved in the 71 M³ global mode band (540.8–2497.1 nm) with Gaussian responses that span the band width of each channel, except for channels beyond 2.5 µm.</w:t>
+        <w:t>We used the LSCC suite of data [32,33] for nine mare soils (Apollo 11, 12, 15 and 17) and ten highland soils (Apollo 14 and 16) analyzed as &lt;10, 10–20, 20–45 and &lt;45 µm fractions measured at 30° incidence and 0° emission. The 10–20 µm spectrum of soil 70181 was not analyzed, leaving 75 spectra. Point-count modal mineralogy (vol%) data for the three finer fractions (56 spectra) was arranged into seven parts: plagioclase (PLG), low-Ca pyroxene (LCP, orthopyroxene plus pigeonite), high-Ca pyroxene (HCP), olivine (OLV), ilmenite (ILM), agglutinitic glass (AGG) and other phases (OTH). Bulk FeO, TiO₂, Al₂O₃, CaO and MgO (wt%) and maturity index Is/FeO are available for all 75 spectra, but have been checked against their column sum and totals. Each spectra is contigated in the 71 M³ global mode band (540.8–2497.1 nm) with Gaussian responses that span the band width of each channel, except for channels smaller than 2.5 µm.</w:t>
       </w:r>
     </w:p>
     <w:p>
@@ -2634,7 +2634,7 @@
       <w:r>
         <w:drawing>
           <wp:inline xmlns:a="http://schemas.openxmlformats.org/drawingml/2006/main" xmlns:pic="http://schemas.openxmlformats.org/drawingml/2006/picture">
-            <wp:extent cx="6120000" cy="2377646"/>
+            <wp:extent cx="6120000" cy="2912530"/>
             <wp:docPr id="1" name="Picture 1"/>
             <wp:cNvGraphicFramePr>
               <a:graphicFrameLocks noChangeAspect="1"/>
@@ -2655,7 +2655,7 @@
                   <pic:spPr>
                     <a:xfrm>
                       <a:off x="0" y="0"/>
-                      <a:ext cx="6120000" cy="2377646"/>
+                      <a:ext cx="6120000" cy="2912530"/>
                     </a:xfrm>
                     <a:prstGeom prst="rect"/>
                   </pic:spPr>
@@ -2710,7 +2710,7 @@
       <w:r>
         <w:drawing>
           <wp:inline xmlns:a="http://schemas.openxmlformats.org/drawingml/2006/main" xmlns:pic="http://schemas.openxmlformats.org/drawingml/2006/picture">
-            <wp:extent cx="6120000" cy="2540446"/>
+            <wp:extent cx="6120000" cy="2907000"/>
             <wp:docPr id="2" name="Picture 2"/>
             <wp:cNvGraphicFramePr>
               <a:graphicFrameLocks noChangeAspect="1"/>
@@ -2731,7 +2731,7 @@
                   <pic:spPr>
                     <a:xfrm>
                       <a:off x="0" y="0"/>
-                      <a:ext cx="6120000" cy="2540446"/>
+                      <a:ext cx="6120000" cy="2907000"/>
                     </a:xfrm>
                     <a:prstGeom prst="rect"/>
                   </pic:spPr>
@@ -2965,7 +2965,7 @@
       <w:r>
         <w:drawing>
           <wp:inline xmlns:a="http://schemas.openxmlformats.org/drawingml/2006/main" xmlns:pic="http://schemas.openxmlformats.org/drawingml/2006/picture">
-            <wp:extent cx="6120000" cy="1861731"/>
+            <wp:extent cx="6120000" cy="2232000"/>
             <wp:docPr id="3" name="Picture 3"/>
             <wp:cNvGraphicFramePr>
               <a:graphicFrameLocks noChangeAspect="1"/>
@@ -2986,7 +2986,7 @@
                   <pic:spPr>
                     <a:xfrm>
                       <a:off x="0" y="0"/>
-                      <a:ext cx="6120000" cy="1861731"/>
+                      <a:ext cx="6120000" cy="2232000"/>
                     </a:xfrm>
                     <a:prstGeom prst="rect"/>
                   </pic:spPr>
@@ -5096,7 +5096,7 @@
       <w:r>
         <w:drawing>
           <wp:inline xmlns:a="http://schemas.openxmlformats.org/drawingml/2006/main" xmlns:pic="http://schemas.openxmlformats.org/drawingml/2006/picture">
-            <wp:extent cx="6120000" cy="2194831"/>
+            <wp:extent cx="6120000" cy="2704186"/>
             <wp:docPr id="4" name="Picture 4"/>
             <wp:cNvGraphicFramePr>
               <a:graphicFrameLocks noChangeAspect="1"/>
@@ -5117,7 +5117,7 @@
                   <pic:spPr>
                     <a:xfrm>
                       <a:off x="0" y="0"/>
-                      <a:ext cx="6120000" cy="2194831"/>
+                      <a:ext cx="6120000" cy="2704186"/>
                     </a:xfrm>
                     <a:prstGeom prst="rect"/>
                   </pic:spPr>
@@ -6682,7 +6682,7 @@
       </w:pPr>
       <w:r>
         <w:rPr/>
-        <w:t>As the pre-trained primary model A4 was not optimal (Section 3.7) the A4/A2 model selection was performed using an inner 5-fold grouped cross-validation for each of the outer folds so that the outer estimates remained confirmatory. A2 was chosen in all cases (19/19 and 6/6 for LOSO and LOMO respectively). This model predicted 1.23 wt% FeO, 0.55 wt% TiO₂ and 2.35 vol%. When compared to the RF model, the A2 performs better on 12/13 targets but not on olivine. It performs better than the RF on 8 targets when corrected for multiple comparisons using the Holm method. These include PLG, LCP, HCP, ILM, FeO (1.23 vs 2.13 wt%), TiO₂, Al₂O₃ and maturity (Holm p = 0.011). When compared to PLS and ridge regression it performs better on 11/13 targets and performs better than the mean of the other soils on 10/13 targets. The LOMO model performs better than the RF model on 6 targets (LCP, HCP, FeO (2.63 wt%), TiO₂, Al₂O₃ and maturity). No differences were found between the A4 and A2 models using either protocol. The models used here have been re-generated using the pre-trained ensemble members on a different machine. This resulted in all the MAE values for each soil being reproduced within 0.06 for all targets, models and protocols. The predictions made by LOSO protocol for 4 key targets are shown in Figure 5.</w:t>
+        <w:t>As the pre-trained primary model A4 was not optimal (Section 3.7) the A4/A2 model selection was performed using an inner 5-fold stratified cross-validation for each of the outer folds so that the outer estimates remained confirmatory. A2 was chosen in all cases (19/19 and 6/6 for LOSO and LOMO respectively). This model predicted 1.23 wt% FeO, 0.55 wt% TiO₂ and 2.35 vol%. When compared to the RF model, the A2 performs worse than A4 on 12/13 targets but is not olivine. It performs better than the RF on 8 targets when corrected for multiple comparisons using the Holm method. These include PLG, LCP, HCP, ILM, FeO (1.23 vs 2.13 wt%), TiO₂, Al₂O₃ and maturity (Holm p = 0.011). When compared to PLS and ridge regression it performs better on 11/13 targets and performs better than the mean of the other soils on 10/13 targets. The LOMO model performs better than the RF model on 6 targets (LCP, HCP, FeO (2.63 wt%), TiO₂, Al₂O₃ and maturity). No differences were found between the A4 and A2 models using either protocol. The models used here have been re-generated using the pre-trained ensemble members on a different machine. This resulted in all the MAE values for each soil being reproduced within 0.06 for all targets, models and protocols. The predictions made by LOSO protocol for 4 key targets are shown in Figure 5.</w:t>
       </w:r>
     </w:p>
     <w:p>
@@ -7914,7 +7914,7 @@
       </w:pPr>
       <w:r>
         <w:rPr/>
-        <w:t>For each method, there are scores in five minerals (CPX, OPX, OLV, PLG, ILM) in proportions of 100% renormalized among three sieved fractions of soils according to the replication from Korokhin et al. (see Table 4). In the LOSO validation, LUMEN achieves an improvement in scores of the same order –54 to 74 percent for each mineral (all Holm-significant); for example, olivine gets the score 1.91 versus 7.44 and plagioclase – 5.55 versus 12.08. In the LOMO validation, LUMEN again obtains better scores for four of the five minerals, being only significant for olivine, but is slightly inferior for plagioclase with the score 12.64 versus 12.08. The inversion method does not see LSCC soils at all, but LUMEN is fine-tuned on the rest soils; therefore, the fair comparison would be for LUMEN A0 (trained only on physics): LUMEN has lower scores in three of the five minerals (being significant for olivine). Is/FeO parameter from LUMEN soils has also greater soil ranking than the nFe parameter from the inverted soils in correlation coefficients (ρ) equal 0.72, 0.81, and 0.96 for &lt;10, 10–20, and 20–45 µm fractions respectively against 0.55, 0.37, and 0.44.</w:t>
+        <w:t>For each method, there are scores in five minerals (CPX, OPX, OLV, PLG, ILM) in proportions of 100% renormalized among three sieved fractions of soils according to the replication from Korokhin et al. (see Table 4). In the LOSO validation, LUMEN achieves an improvement in scores of the same order –54 to 74 percent for each mineral (all Holm-significant); for example, olivine gets the score 1.91 versus 7.44 and plagioclase – 5.55 versus 12.08. In the LOMO validation, LUMEN again obtains better scores for four of the five minerals, being only significant for olivine, but is slightly inferior for plagioclase with the score 12.64 versus 12.08. The inversion method does not produce LSCC soils at all, but LUMEN is fine-tuned on the rest soils; therefore, the fair comparison would be for LUMEN without training on A0 (only physics): LUMEN has lower scores in three of the five minerals (being significant for olivine). Is/FeO parameter from LUMEN soils has also greater soil ranking than the nFe parameter from the inverted soils in correlation coefficients (ρ) equal 0.72, 0.81, and 0.96 for &lt;10, 10–20, and 20–45 µm fractions respectively against 0.55, 0.37, and 0.44.</w:t>
       </w:r>
     </w:p>
     <w:p>
@@ -8658,7 +8658,7 @@
       </w:pPr>
       <w:r>
         <w:rPr/>
-        <w:t>For the four soils investigated by Jung et al. (samples 12001, 12030, 15071, and 71061; grain size 20–45 µm), scored on the proportions of crystalline phases, the LOSO error of LUMEN is 1.00 for olivine, 1.24 for ilmenite, and 7.95 for plagioclase, and thus satisfies all three known accuracy levels (7, 10, and 30 points). On the other hand, the inversion results in 17.56 points for ilmenite. Considering that only four soils have been examined, this provides lacking evidence: the zero-shot model satisfies all conditions simultaneously, while the average result for other soils does not satisfy the limits of ilmenite and plagioclase. The Is/FeO ratio from LUMEN compares to the measured one at r = 0.99, while the maturity index from the inversion is at approximately r = 0.00.</w:t>
+        <w:t>For the four soils investigated by Jung et al. (samples 12001, 12030, 15071, and 71061; grain size 20–45 µm), arranged in descending order according to the amount of crystalline phases, the LOSS error of LUMEN is 1.00 for olivine, 1.24 for ilmenite, and 7.95 for plagioclase, and thus satisfies all three known accuracy levels (7, 10, and 30 points). On the other hand, the inverted maturity index results in 17.56 points for ilmenite. Considering that only four soils have been examined, this provides lacking evidence: the zero-shot model satisfies all conditions simultaneously, while the average result for other soils does not satisfy the limits of ilmenite and plagioclase. The Is/FeO ratio from LUMEN compares to the measured one at r = 0.99, while the maturity index from the inversion is at approximately r = 0.00.</w:t>
       </w:r>
     </w:p>
     <w:p>
@@ -9680,7 +9680,7 @@
       </w:pPr>
       <w:r>
         <w:rPr/>
-        <w:t>The base method is assessed for its performance for its assigned task of FeO in orbits employing its ground truth data [16,31], according to two different schemes of tests, P1 and P2 (Figure 4), where P1 represents the internal 10-fold cross validation over the sites of the base study, which is consistent with the MAE of 2.29 wt% reported; and P2 represents leave-one-landing site out test in which all sites from one mission is left out because of common terrain and spatial autocorrelation (Table 6).</w:t>
+        <w:t>The base method is assessed for its performance for its assigned task of FeO in orbits employing its ground truth data [16,31], according to two different schemes of tests, P1 and P2 (Figure 4), where P1 represents the internal 10-fold cross validation within each site of the base study, which is consistent with the MAE of 2.29 wt% reported; and P2 represents leave-one-landing site out test in which all sites from one mission is left out because of common terrain and spatial autocorrelation.</w:t>
       </w:r>
     </w:p>
     <w:p>
@@ -12251,7 +12251,7 @@
       </w:pPr>
       <w:r>
         <w:rPr/>
-        <w:t>In the primary assessment (P2), LUMEN-M3-FT shows a smaller MAE than the published FD (3.27 vs 3.58 wt%), but it is more accurate than the latter only at 24 out of 49 locations, and the result does not reach statistical significance (Wilcoxon p = 0.74; Holm p = 1.00 for 13 comparisons). Statistical superiority is shown only against the training-fold mean (Holm p &lt; 0.001), and it is statistically inferior to the two M³ bands (Holm p = 0.009), FD-AE-M3 / SVR-lin (Holm p = 0.029), the two Clementine bands (Holm p = 0.001), and the in-sample Lucey et al. constants (Holm p &lt; 0.001). According to P1, the published FD value (1.90 wt%) correlates well with the reproduced results of the original paper (1.95 wt%) and is lower than its previously reported 2.29 wt% [16]. The LUMEN-M3-FT value (2.20 wt%) does not differ significantly from the FD values or the two M³ bands, is significantly less accurate than the two Clementine bands (Holm p = 0.020), and at the same time, is significantly more accurate than the refitted Lucey θ on M³ (Holm p = 0.020).</w:t>
+        <w:t>In the primary assessment (P2), LUMEN-M3-FT shows a smaller MAE than the published FD (3.27 vs 3.58 wt%), but it is more accurate than the latter only at 24 out of 49 locations, and the result does not reach statistical significance (Wilcoxon p = 0.74; Holm p = 1.00 for 13 comparisons). Statistical superiority is shown only against the training-fold mean (Holm p &lt; 0.001), and it is statistically inferior to the two M³ bands (Holm p = 0.009), FD-AE-M3 / SVR-lin (Holm p = 0.029), the two Clementine bands (Holm p = 0.001), and the in-sample Lucey et al. constants (Holm p &lt; 0.001). According to P1, the published FD value (1.90 wt%) correlates well with the reproduced results of the original paper (1.95 wt%) and is lower than its previously reported 2.29 wt% [16]. The LUMEN-M3-FT value (2.20 wt%) significantly differs from no-FD values and the two M³ bands, is significantly less accurate than the two Clementine bands (Holm p = 0.020), and at the same time, is significantly more accurate than the refitted Lucey θ on M³ (Holm p = 0.020).</w:t>
       </w:r>
     </w:p>
     <w:p>
@@ -14032,7 +14032,7 @@
       </w:pPr>
       <w:r>
         <w:rPr/>
-        <w:t>There are four design alternatives which were pre-trained and fine-tuned using the A4 recipe, each with two members, relative to members 0–1 of the baseline network (Table 8; FeO 1.32 wt% under LOSO and 2.62 wt% under LOMO). The log reflectance feature on its own already achieves non-significantly different performance compared to the other designs, suggesting that the continuum-removed channel does not add any significant advantage; similarly on other side, the continuum-removed channel on its own achieves significantly lower accuracy on six targets under LOSO and eight targets under LOMO (FeO 2.09 and 3.86 wt%, respectively). The multilayer perceptron (MLP) design is significantly inferior for LCP under LOSO, but significantly superior on four targets under LOMO (PLG, FeO, Al₂O₃, and CaO; FeO 2.30 wt%).</w:t>
+        <w:t>There are four design alternatives which were pre-trained and fine-tuned using the A4 recipe, each with two members, relative to members 0–1 of the baseline network (Table 8; FeO 1.32 wt% under LOSO and 2.62 wt% under LOMO). The log reflectance feature on its own already achieves non-significantly different performance compared to the other designs, suggesting that the continuum-removed channel does not add any significant advantage; similarly on other side, the continuum-removed channel on its own achieves significantly lower accuracy on six targets under LOSO and eight targets under LOMO (FeO 2.09 and 3.86 wt%, respectively). The multilayer perceptron (MLP) design is significantly inferior to the LCP design under LOSO, but significantly superior to it on four targets under LOMO (PLG, FeO, Al₂O₃, and CaO; FeO 2.30 wt%).</w:t>
       </w:r>
     </w:p>
     <w:p>
@@ -14048,7 +14048,7 @@
       </w:r>
       <w:r>
         <w:rPr/>
-        <w:t xml:space="preserve"> Alternative designs compared with the main network (alternative: two members, thirteen targets, Holm adjustment performed on targets): "Lower MAE": The number of targets in which the MAE of the variant is lower than the one from the main network per soil. "Better / Worse": The number of targets where a Holm significant difference in favor of or against the variant exists.</w:t>
+        <w:t xml:space="preserve"> Alternative designs compared with the main network (alternative: two members, target: thirteen sites, Holm adjustment performed on targets): "Lower MAE": The number of targets in which the MAE of the variant is lower than the one from the main network per soil. "Better / Worse": The number of targets where a Holm significant difference in favor of or against the variant exists.</w:t>
       </w:r>
     </w:p>
     <w:tbl>
@@ -14765,7 +14765,7 @@
       </w:pPr>
       <w:r>
         <w:rPr/>
-        <w:t>The rest add in various ways. Total learning through the entire range is a real component in the performance gain since even a network trained from scratch is already better than a tuned random forest. But the convolutional architecture is a good but not an optimal design – the continuum removed channel gives no improvement at all, a one-dimensional ResNet works equally well, and an MLP better generalizes to an unseen mission on four targets. Physics pretraining is consistently beneficial but its importance is significant only for out-of-distribution tasks, which makes the simulator not a calibrated forward model, but a source for an improved starting representation instead. Neither SSA-space mixup nor replay brought anything after pretraining, whether due to smoothness over the composition space being provided by pretraining, or inability to check the validity of the cross-section mixing weight: the sieve fraction spectra mixes linearly to 0.6% RMS, but the LSCC chemistry does not limit the mass ratios strongly enough. And finally, choosing the configuration within each training fold maintains the considerable performance edge over the random forest, independent of post-hoc configuration selection.</w:t>
+        <w:t>The rest add in various ways. Total learning through the entire range is a real component in the performance gain since even a network trained from scratch is already better than a tuned random forest. But the convolutional architecture is a good but not an optimal design – the continuum removed channel gives no improvement at all, a one-dimensional ResNet works equally well, and an MLP better generalizes to an unseen target comprising four channels. Physics pretraining is consistently beneficial but its importance is significant only for out-of-distribution tasks, which makes the simulator not a calibrated forward model, but a source for an improved starting representation instead. Neither SSA-space mixup nor replay brought anything after pretraining, whether due to smoothness over the composition space being provided by pretraining, or inability to check the validity of the cross-section mixing weight: the sieve fraction spectra mixes linearly to 0.6% RMS, but the LSCC chemistry does not limit the mass ratios strongly enough. And finally, choosing the configuration within each training fold maintains the considerable performance edge over the random forest, making configuration selection unnecessary.</w:t>
       </w:r>
     </w:p>
     <w:p>
@@ -14803,7 +14803,7 @@
       </w:pPr>
       <w:r>
         <w:rPr/>
-        <w:t>As for the inherent purpose of the base method, the resulting errors are contradictory to the LUMEN. In cases when whole landing sites (P2) are excluded, most of the fitted models produce greater errors than models based on randomly chosen folds (P1); however, the scale of this difference is significantly different: the maximum increase is observed in the random forest and RBF-SVR models – it is within the range between 55% and 88%, whereas the FD error rate rises from 1.90 to 3.58 wt%. The LUMEN-M3-FT model has a percentage increase in errors – by 49%, whereas the two-M³-band and linear SVR regression models have the lowest values – the difference is within the range of 6% and from −1% to +2%, respectively. If randomly chosen folds are used, flexible models can use the spectral properties of the adjacent landing site.</w:t>
+        <w:t>As for the inherent purpose of the base method, the resulting errors are contradictory to the LUMEN. In cases when whole landing sites (P2) are excluded, most of the fitted models produce greater errors than models based on randomly chosen folds (P1); however, the scale of this difference is significantly different: the maximum decrease is observed in the random forest and RBF-SVR models – it is within the range between 55% and 88%, whereas the FD error rate rises from 1.90 to 3.58 wt%. The LUMEN-M3-FT model has the biggest percentage increase in errors – by 49%, whereas the two-M³-band and linear SVR regression models have the lowest values – the difference is within the range of 6% and from −1% to +2%, respectively. If randomly chosen folds are used, flexible models can use the spectral properties of the adjacent landing site.</w:t>
       </w:r>
     </w:p>
     <w:p>
@@ -14840,7 +14840,7 @@
       </w:pPr>
       <w:r>
         <w:rPr/>
-        <w:t>Deep ensembles tend to be over-confident, especially when dealing with out-of-distribution data. Normalized conformal calibration helps fix this, bringing coverage back to near-nominal levels, and you get this benefit without any extra training. This holds even in orbit, where at 95% coverage, the intervals average ±10.6 wt%. So, you get honest intervals—they're accurate, though not always practically useful. The gating method clarifies something that other approaches only hint at: we can’t actually predict olivine abundance in these soils any better than simply taking the mean from other soils. None of the methods we tried did any better. As a result, maps showing olivine and "other" from physics-based inversion methods just mirror their priors and end-member sets if you don’t have independent evidence to back them up. But don't misinterpret this: these soils just happen to contain very little olivine (≤5 vol%). So, this is a specific statement about the LSCC domain. It’s not saying olivine can’t be detected at all—just that it’s rare here.</w:t>
+        <w:t>Deep ensembles tend to be over-confident, especially when dealing with out-of-distribution data. Normalized conformal calibration helps fix this, bringing coverage back to near-nominal levels, and you get this benefit without any extra training. This holds even in orbit, where at 95% coverage, the intervals average ±10.6 wt%. So, you get honest intervals—they're accurate, though not always practically useful. The gating method clarifies something that other approaches only hint at: we can’t actually predict olivine abundance in these soils any better than simply taking the mean from other soils. None of the methods we tried did any better. As a result, maps showing olivine and "other" from physics-based inversion methods just mirror their priors and end-member sets if you don’t have independent evidence to back them up. But don't misinterpret this: these soils just happen to contain very little olivine (≤5 vol%). So, this is a specific statement about the LSCC domain. It’s not saying olivine can’t be detected at all—just that it’s rare here. Where olivine is plentiful, detection isn’t an issue.</w:t>
       </w:r>
     </w:p>
     <w:p>

</xml_diff>